<commit_message>
Milestones, update gantt, update README
</commit_message>
<xml_diff>
--- a/docs/Plan projekta.docx
+++ b/docs/Plan projekta.docx
@@ -685,94 +685,55 @@
     <w:p>
       <w:pPr>
         <w:pStyle w:val="InfoBlue"/>
-        <w:rPr>
-          <w:lang w:val="hr-HR"/>
-        </w:rPr>
       </w:pPr>
     </w:p>
     <w:p>
       <w:pPr>
         <w:pStyle w:val="InfoBlue"/>
-        <w:rPr>
-          <w:lang w:val="hr-HR"/>
-        </w:rPr>
-      </w:pPr>
-      <w:r>
-        <w:rPr>
-          <w:lang w:val="hr-HR"/>
-        </w:rPr>
+      </w:pPr>
+      <w:r>
         <w:t>Na koji način koristiti predložak?</w:t>
       </w:r>
     </w:p>
     <w:p>
       <w:pPr>
         <w:pStyle w:val="InfoBlue"/>
-        <w:rPr>
-          <w:lang w:val="hr-HR"/>
-        </w:rPr>
       </w:pPr>
     </w:p>
     <w:p>
       <w:pPr>
         <w:pStyle w:val="InfoBlue"/>
-        <w:rPr>
-          <w:lang w:val="hr-HR"/>
-        </w:rPr>
-      </w:pPr>
-      <w:r>
-        <w:rPr>
-          <w:lang w:val="hr-HR"/>
-        </w:rPr>
+      </w:pPr>
+      <w:r>
         <w:t>Tekst pisan u italic formi opisuje koje informacije je potrebno uključiti u pojedino poglavlje Prijedloga.</w:t>
       </w:r>
     </w:p>
     <w:p>
       <w:pPr>
         <w:pStyle w:val="InfoBlue"/>
-        <w:rPr>
-          <w:lang w:val="hr-HR"/>
-        </w:rPr>
-      </w:pPr>
-      <w:r>
-        <w:rPr>
-          <w:lang w:val="hr-HR"/>
-        </w:rPr>
+      </w:pPr>
+      <w:r>
         <w:t xml:space="preserve">Za upis vlastitog teksta, potrebno je pritisnuti &lt;ENTER&gt; nakon italic teksta. </w:t>
       </w:r>
     </w:p>
     <w:p>
       <w:pPr>
         <w:pStyle w:val="InfoBlue"/>
-        <w:rPr>
-          <w:lang w:val="hr-HR"/>
-        </w:rPr>
-      </w:pPr>
-      <w:r>
-        <w:rPr>
-          <w:lang w:val="hr-HR"/>
-        </w:rPr>
+      </w:pPr>
+      <w:r>
         <w:t>Tekst upisan u &lt;trokutastim zagradama&gt; treba zamijeniti s onim što se navodi.</w:t>
       </w:r>
     </w:p>
     <w:p>
       <w:pPr>
         <w:pStyle w:val="InfoBlue"/>
-        <w:rPr>
-          <w:lang w:val="hr-HR"/>
-        </w:rPr>
       </w:pPr>
     </w:p>
     <w:p>
       <w:pPr>
         <w:pStyle w:val="InfoBlue"/>
-        <w:rPr>
-          <w:lang w:val="hr-HR"/>
-        </w:rPr>
-      </w:pPr>
-      <w:r>
-        <w:rPr>
-          <w:lang w:val="hr-HR"/>
-        </w:rPr>
+      </w:pPr>
+      <w:r>
         <w:t>Svi članovi tima trebaju pročitati plan i suglasiti se s njime, a to potvrđuju svojim potpisom na kraju dokumenta.</w:t>
       </w:r>
     </w:p>
@@ -815,26 +776,85 @@
     <w:p>
       <w:pPr>
         <w:pStyle w:val="BodyText"/>
-        <w:rPr>
-          <w:lang w:val="hr-HR"/>
-        </w:rPr>
-      </w:pPr>
-      <w:r>
-        <w:rPr>
-          <w:lang w:val="hr-HR"/>
-        </w:rPr>
-        <w:t xml:space="preserve">Okolina igrice, model osmišljenog grada, a i sam model drona ostvarit će se pomoću programa Blender te biti uključeni u igricu napravljenu u Godot Engineu. </w:t>
+      </w:pPr>
+      <w:r>
+        <w:rPr>
+          <w:lang w:val="hr-HR"/>
+        </w:rPr>
+        <w:t xml:space="preserve">Okolina </w:t>
+      </w:r>
+      <w:r>
+        <w:rPr>
+          <w:lang w:val="hr-HR"/>
+        </w:rPr>
+        <w:t>igre</w:t>
+      </w:r>
+      <w:r>
+        <w:rPr>
+          <w:lang w:val="hr-HR"/>
+        </w:rPr>
+        <w:t xml:space="preserve">, model osmišljenog grada, a i sam model drona ostvarit će se pomoću programa Blender te biti uključeni u </w:t>
+      </w:r>
+      <w:r>
+        <w:rPr>
+          <w:lang w:val="hr-HR"/>
+        </w:rPr>
+        <w:t>igru</w:t>
+      </w:r>
+      <w:r>
+        <w:rPr>
+          <w:lang w:val="hr-HR"/>
+        </w:rPr>
+        <w:t xml:space="preserve"> napravljenu u Godot Engineu. </w:t>
       </w:r>
       <w:r>
         <w:br w:type="page"/>
       </w:r>
+    </w:p>
+    <w:p>
+      <w:pPr>
+        <w:jc w:val="center"/>
+        <w:rPr>
+          <w:rFonts w:ascii="Arial" w:hAnsi="Arial" w:cs="Arial"/>
+          <w:b/>
+          <w:bCs/>
+          <w:sz w:val="32"/>
+          <w:szCs w:val="32"/>
+          <w:lang w:val="hr-HR"/>
+        </w:rPr>
+      </w:pPr>
+      <w:r>
+        <w:rPr>
+          <w:rFonts w:ascii="Arial" w:hAnsi="Arial" w:cs="Arial"/>
+          <w:b/>
+          <w:bCs/>
+          <w:sz w:val="32"/>
+          <w:szCs w:val="32"/>
+          <w:lang w:val="hr-HR"/>
+        </w:rPr>
+        <w:lastRenderedPageBreak/>
+        <w:t>Prijedlog i plan projekta</w:t>
+      </w:r>
+    </w:p>
+    <w:p>
+      <w:pPr>
+        <w:jc w:val="center"/>
+        <w:rPr>
+          <w:rFonts w:ascii="Arial" w:hAnsi="Arial" w:cs="Arial"/>
+          <w:b/>
+          <w:bCs/>
+          <w:sz w:val="28"/>
+          <w:szCs w:val="28"/>
+          <w:lang w:val="hr-HR"/>
+        </w:rPr>
+      </w:pPr>
     </w:p>
     <w:p>
       <w:pPr>
         <w:pStyle w:val="Heading1"/>
         <w:numPr>
           <w:ilvl w:val="0"/>
-          <w:numId w:val="0"/>
+          <w:numId w:val="5"/>
         </w:numPr>
         <w:spacing w:before="0"/>
         <w:rPr>
@@ -846,7 +866,6 @@
         <w:rPr>
           <w:lang w:val="hr-HR"/>
         </w:rPr>
-        <w:lastRenderedPageBreak/>
         <w:t>Puni naziv projekta</w:t>
       </w:r>
       <w:bookmarkEnd w:id="0"/>
@@ -854,14 +873,8 @@
     <w:p>
       <w:pPr>
         <w:pStyle w:val="InfoBlue"/>
-        <w:rPr>
-          <w:lang w:val="hr-HR"/>
-        </w:rPr>
-      </w:pPr>
-      <w:r>
-        <w:rPr>
-          <w:lang w:val="hr-HR"/>
-        </w:rPr>
+      </w:pPr>
+      <w:r>
         <w:t>[Navesti puni naziv projekta iz kojeg će biti vidljiva problematika/tematika kojom se projekt bavi.]</w:t>
       </w:r>
     </w:p>
@@ -881,40 +894,72 @@
     </w:p>
     <w:p>
       <w:pPr>
+        <w:pStyle w:val="Heading1"/>
+        <w:numPr>
+          <w:ilvl w:val="0"/>
+          <w:numId w:val="5"/>
+        </w:numPr>
+        <w:rPr>
+          <w:lang w:val="hr-HR"/>
+        </w:rPr>
+      </w:pPr>
+      <w:bookmarkStart w:id="1" w:name="_Toc179182955"/>
+      <w:r>
+        <w:rPr>
+          <w:lang w:val="hr-HR"/>
+        </w:rPr>
+        <w:t>Skraćeni naziv projekta</w:t>
+      </w:r>
+      <w:bookmarkEnd w:id="1"/>
+    </w:p>
+    <w:p>
+      <w:pPr>
+        <w:pStyle w:val="InfoBlue"/>
+      </w:pPr>
+      <w:r>
+        <w:t>[Navesti skraćeni naziv projekta, ako je definiran.]</w:t>
+      </w:r>
+    </w:p>
+    <w:p>
+      <w:pPr>
         <w:pStyle w:val="BodyText"/>
         <w:rPr>
           <w:lang w:val="hr-HR"/>
         </w:rPr>
       </w:pPr>
+      <w:r>
+        <w:rPr>
+          <w:lang w:val="hr-HR"/>
+        </w:rPr>
+        <w:t>Dron.co</w:t>
+      </w:r>
     </w:p>
     <w:p>
       <w:pPr>
         <w:pStyle w:val="Heading1"/>
-        <w:rPr>
-          <w:lang w:val="hr-HR"/>
-        </w:rPr>
-      </w:pPr>
-      <w:bookmarkStart w:id="1" w:name="_Toc179182955"/>
-      <w:r>
-        <w:rPr>
-          <w:lang w:val="hr-HR"/>
-        </w:rPr>
-        <w:t>Skraćeni naziv projekta</w:t>
-      </w:r>
-      <w:bookmarkEnd w:id="1"/>
+        <w:numPr>
+          <w:ilvl w:val="0"/>
+          <w:numId w:val="5"/>
+        </w:numPr>
+        <w:rPr>
+          <w:lang w:val="hr-HR"/>
+        </w:rPr>
+      </w:pPr>
+      <w:bookmarkStart w:id="2" w:name="_Toc179182956"/>
+      <w:r>
+        <w:rPr>
+          <w:lang w:val="hr-HR"/>
+        </w:rPr>
+        <w:t>Opis problema/teme projekta</w:t>
+      </w:r>
+      <w:bookmarkEnd w:id="2"/>
     </w:p>
     <w:p>
       <w:pPr>
         <w:pStyle w:val="InfoBlue"/>
-        <w:rPr>
-          <w:lang w:val="hr-HR"/>
-        </w:rPr>
-      </w:pPr>
-      <w:r>
-        <w:rPr>
-          <w:lang w:val="hr-HR"/>
-        </w:rPr>
-        <w:t>[Navesti skraćeni naziv projekta, ako je definiran.]</w:t>
+      </w:pPr>
+      <w:r>
+        <w:t>[Objasniti problem, odnosno temu projekta, objasniti ukratko tip, uvjete i kontekst projekta.]</w:t>
       </w:r>
     </w:p>
     <w:p>
@@ -928,37 +973,49 @@
         <w:rPr>
           <w:lang w:val="hr-HR"/>
         </w:rPr>
-        <w:t>Dron.co</w:t>
+        <w:t>Cilj projekta je izraditi simulaciju dostave paketa dronom u obliku zabavne interaktivne igre. Igrač će pomoću fizičkog upravljača, odnosno kontrolera, upravljati dronom kroz 3D model gradske okoline. Cilj igre jest dostaviti paket na određenu lokaciju u što kraćem vremenu.</w:t>
+      </w:r>
+    </w:p>
+    <w:p>
+      <w:pPr>
+        <w:pStyle w:val="BodyText"/>
+        <w:rPr>
+          <w:lang w:val="hr-HR"/>
+        </w:rPr>
+      </w:pPr>
+      <w:r>
+        <w:rPr>
+          <w:lang w:val="hr-HR"/>
+        </w:rPr>
+        <w:t>Projekt će spojiti timski rad, zabavu, dizajn, tehničko modeliranje i osnovne principe fizike letenja drona, a ostvarit će se pomoću 3D modeliranja u Blenderu i razvoja u Godot Engineu.</w:t>
       </w:r>
     </w:p>
     <w:p>
       <w:pPr>
         <w:pStyle w:val="Heading1"/>
-        <w:rPr>
-          <w:lang w:val="hr-HR"/>
-        </w:rPr>
-      </w:pPr>
-      <w:bookmarkStart w:id="2" w:name="_Toc179182956"/>
-      <w:r>
-        <w:rPr>
-          <w:lang w:val="hr-HR"/>
-        </w:rPr>
-        <w:t>Opis problema/teme projekta</w:t>
-      </w:r>
-      <w:bookmarkEnd w:id="2"/>
+        <w:numPr>
+          <w:ilvl w:val="0"/>
+          <w:numId w:val="5"/>
+        </w:numPr>
+        <w:rPr>
+          <w:lang w:val="hr-HR"/>
+        </w:rPr>
+      </w:pPr>
+      <w:bookmarkStart w:id="3" w:name="_Toc179182957"/>
+      <w:r>
+        <w:rPr>
+          <w:lang w:val="hr-HR"/>
+        </w:rPr>
+        <w:t>Cilj projekta</w:t>
+      </w:r>
+      <w:bookmarkEnd w:id="3"/>
     </w:p>
     <w:p>
       <w:pPr>
         <w:pStyle w:val="InfoBlue"/>
-        <w:rPr>
-          <w:lang w:val="hr-HR"/>
-        </w:rPr>
-      </w:pPr>
-      <w:r>
-        <w:rPr>
-          <w:lang w:val="hr-HR"/>
-        </w:rPr>
-        <w:t>[Objasniti problem, odnosno temu projekta, objasniti ukratko tip, uvjete i kontekst projekta.]</w:t>
+      </w:pPr>
+      <w:r>
+        <w:t>[Navesti predviđeni cilj ili ciljeve projekta. Definiranje ciljeva omogućuje određivanje pravca u kojem će se kretati izvođenje projekta. Navesti predviđeno trajanje projekta.]</w:t>
       </w:r>
     </w:p>
     <w:p>
@@ -972,7 +1029,7 @@
         <w:rPr>
           <w:lang w:val="hr-HR"/>
         </w:rPr>
-        <w:t>Cilj projekta je izraditi simulaciju dostave paketa dronom u obliku zabavne interaktivne igre. Igrač će pomoću fizičkog upravljača, odnosno kontrolera, upravljati dronom kroz 3D model gradske okoline. Cilj igre jest dostaviti paket na određenu lokaciju u što kraćem vremenu.</w:t>
+        <w:t>Glavni cilj projekta razvoj je funkcionalne i vizualno privlačne igre koja simulira dostavu paketa dronom.</w:t>
       </w:r>
     </w:p>
     <w:p>
@@ -986,37 +1043,63 @@
         <w:rPr>
           <w:lang w:val="hr-HR"/>
         </w:rPr>
-        <w:t>Projekt će spojiti timski rad, zabavu, dizajn, tehničko modeliranje i osnovne principe fizike letenja drona, a ostvarit će se pomoću 3D modeliranja u Blenderu i razvoja u Godot Engineu.</w:t>
+        <w:t xml:space="preserve">Potrebno je implementirati kontrole kako bi igrač mogao kontrolirati dron kontrolerom, fizike letenja u Godotu. Razviti logiku dostave paketa, osmisliti predviđene rute dostava, potencijalne prepreke i ostale hazarde tijekom leta (pražnjenje baterije, postaje za punjenje…). Potrebno je osmisliti sustav bodovanja i uvjete pobjede. Potrebno je izraditi 3D modele grada i drona u Blenderu. </w:t>
+      </w:r>
+    </w:p>
+    <w:p>
+      <w:pPr>
+        <w:pStyle w:val="BodyText"/>
+        <w:rPr>
+          <w:lang w:val="hr-HR"/>
+        </w:rPr>
+      </w:pPr>
+      <w:r>
+        <w:rPr>
+          <w:lang w:val="hr-HR"/>
+        </w:rPr>
+        <w:t>Krajnje, potrebno je testirati igru među članovima tima, a nakon toga i testiranje na nepovezanom igraču, nevezanom za tim. Po potrebi provesti optimizacije performansa, popraviti neispravnosti.</w:t>
+      </w:r>
+    </w:p>
+    <w:p>
+      <w:pPr>
+        <w:pStyle w:val="BodyText"/>
+        <w:rPr>
+          <w:lang w:val="hr-HR"/>
+        </w:rPr>
+      </w:pPr>
+      <w:r>
+        <w:rPr>
+          <w:lang w:val="hr-HR"/>
+        </w:rPr>
+        <w:t>Uključujući testiranja, očekivano trajanje projekta je 15 tjedana.</w:t>
       </w:r>
     </w:p>
     <w:p>
       <w:pPr>
         <w:pStyle w:val="Heading1"/>
-        <w:rPr>
-          <w:lang w:val="hr-HR"/>
-        </w:rPr>
-      </w:pPr>
-      <w:bookmarkStart w:id="3" w:name="_Toc179182957"/>
-      <w:r>
-        <w:rPr>
-          <w:lang w:val="hr-HR"/>
-        </w:rPr>
-        <w:t>Cilj projekta</w:t>
-      </w:r>
-      <w:bookmarkEnd w:id="3"/>
+        <w:numPr>
+          <w:ilvl w:val="0"/>
+          <w:numId w:val="5"/>
+        </w:numPr>
+        <w:rPr>
+          <w:lang w:val="hr-HR"/>
+        </w:rPr>
+      </w:pPr>
+      <w:bookmarkStart w:id="4" w:name="_Toc179182958"/>
+      <w:r>
+        <w:rPr>
+          <w:lang w:val="hr-HR"/>
+        </w:rPr>
+        <w:t>Voditelj studentskog tima</w:t>
+      </w:r>
+      <w:bookmarkEnd w:id="4"/>
     </w:p>
     <w:p>
       <w:pPr>
         <w:pStyle w:val="InfoBlue"/>
-        <w:rPr>
-          <w:lang w:val="hr-HR"/>
-        </w:rPr>
-      </w:pPr>
-      <w:r>
-        <w:rPr>
-          <w:lang w:val="hr-HR"/>
-        </w:rPr>
-        <w:t>[Navesti predviđeni cilj ili ciljeve projekta. Definiranje ciljeva omogućuje određivanje pravca u kojem će se kretati izvođenje projekta. Navesti predviđeno trajanje projekta.]</w:t>
+      </w:pPr>
+      <w:r>
+        <w:t>&lt;Ime i prezime studenta&gt;</w:t>
       </w:r>
     </w:p>
     <w:p>
@@ -1030,7 +1113,35 @@
         <w:rPr>
           <w:lang w:val="hr-HR"/>
         </w:rPr>
-        <w:t>Glavni cilj projekta razvoj je funkcionalne i vizualno privlačne igre koja simulira dostavu paketa dronom.</w:t>
+        <w:t>Jakov Ramljak</w:t>
+      </w:r>
+    </w:p>
+    <w:p>
+      <w:pPr>
+        <w:pStyle w:val="Heading1"/>
+        <w:numPr>
+          <w:ilvl w:val="0"/>
+          <w:numId w:val="5"/>
+        </w:numPr>
+        <w:rPr>
+          <w:lang w:val="hr-HR"/>
+        </w:rPr>
+      </w:pPr>
+      <w:bookmarkStart w:id="5" w:name="_Toc179182959"/>
+      <w:r>
+        <w:rPr>
+          <w:lang w:val="hr-HR"/>
+        </w:rPr>
+        <w:t>Rezultat(i)</w:t>
+      </w:r>
+      <w:bookmarkEnd w:id="5"/>
+    </w:p>
+    <w:p>
+      <w:pPr>
+        <w:pStyle w:val="InfoBlue"/>
+      </w:pPr>
+      <w:r>
+        <w:t>[Navesti što će se isporučiti na kraju projekta, voditi računa da osim rezultata u vidu nekog proizvoda ovdje treba navesti i svu dokumentaciju.]</w:t>
       </w:r>
     </w:p>
     <w:p>
@@ -1044,7 +1155,7 @@
         <w:rPr>
           <w:lang w:val="hr-HR"/>
         </w:rPr>
-        <w:t xml:space="preserve">Potrebno je implementirati kontrole kako bi igrač mogao kontrolirati dron kontrolerom, fizike letenja u Godotu. Razviti logiku dostave paketa, osmisliti predviđene rute dostava, potencijalne prepreke i ostale hazarde tijekom leta (pražnjenje baterije, postaje za punjenje…). Potrebno je osmisliti sustav bodovanja i uvjete pobjede. Potrebno je izraditi 3D modele grada i drona u Blenderu. </w:t>
+        <w:t>Funkcionalna igra Dron.co</w:t>
       </w:r>
     </w:p>
     <w:p>
@@ -1058,7 +1169,7 @@
         <w:rPr>
           <w:lang w:val="hr-HR"/>
         </w:rPr>
-        <w:t>Krajnje, potrebno je testirati igru među članovima tima, a nakon toga i testiranje na nepovezanom igraču, nevezanom za tim. Po potrebi provesti optimizacije performansa, popraviti neispravnosti.</w:t>
+        <w:t>3D modeli elemenata grada, drona, paketa</w:t>
       </w:r>
     </w:p>
     <w:p>
@@ -1072,7 +1183,35 @@
         <w:rPr>
           <w:lang w:val="hr-HR"/>
         </w:rPr>
-        <w:t>Uključujući testiranja, očekivano trajanje projekta je 15 tjedana.</w:t>
+        <w:t>Odrađeni plan projekta, tehnička dokumentacija te vizualna i interaktivna prezentacija projekta</w:t>
+      </w:r>
+    </w:p>
+    <w:p>
+      <w:pPr>
+        <w:pStyle w:val="Heading1"/>
+        <w:numPr>
+          <w:ilvl w:val="0"/>
+          <w:numId w:val="5"/>
+        </w:numPr>
+        <w:rPr>
+          <w:lang w:val="hr-HR"/>
+        </w:rPr>
+      </w:pPr>
+      <w:bookmarkStart w:id="6" w:name="_Toc179182960"/>
+      <w:r>
+        <w:rPr>
+          <w:lang w:val="hr-HR"/>
+        </w:rPr>
+        <w:t>Slični projekti</w:t>
+      </w:r>
+      <w:bookmarkEnd w:id="6"/>
+    </w:p>
+    <w:p>
+      <w:pPr>
+        <w:pStyle w:val="InfoBlue"/>
+      </w:pPr>
+      <w:r>
+        <w:t xml:space="preserve">[Navesti projekte koji su povezani s dotičnim projektom.] </w:t>
       </w:r>
     </w:p>
     <w:p>
@@ -1082,192 +1221,43 @@
           <w:lang w:val="hr-HR"/>
         </w:rPr>
       </w:pPr>
+      <w:r>
+        <w:rPr>
+          <w:lang w:val="hr-HR"/>
+        </w:rPr>
+        <w:t>(po dogovoru)</w:t>
+      </w:r>
+    </w:p>
+    <w:p>
+      <w:pPr>
+        <w:pStyle w:val="BodyText"/>
+        <w:rPr>
+          <w:lang w:val="hr-HR"/>
+        </w:rPr>
+      </w:pPr>
+    </w:p>
+    <w:p>
+      <w:pPr>
+        <w:widowControl/>
+        <w:spacing w:line="240" w:lineRule="auto"/>
+        <w:rPr>
+          <w:lang w:val="hr-HR"/>
+        </w:rPr>
+      </w:pPr>
+      <w:r>
+        <w:rPr>
+          <w:lang w:val="hr-HR"/>
+        </w:rPr>
+        <w:br w:type="page"/>
+      </w:r>
     </w:p>
     <w:p>
       <w:pPr>
         <w:pStyle w:val="Heading1"/>
-        <w:rPr>
-          <w:lang w:val="hr-HR"/>
-        </w:rPr>
-      </w:pPr>
-      <w:bookmarkStart w:id="4" w:name="_Toc179182958"/>
-      <w:r>
-        <w:rPr>
-          <w:lang w:val="hr-HR"/>
-        </w:rPr>
-        <w:t>Voditelj studentskog tima</w:t>
-      </w:r>
-      <w:bookmarkEnd w:id="4"/>
-    </w:p>
-    <w:p>
-      <w:pPr>
-        <w:pStyle w:val="InfoBlue"/>
-        <w:rPr>
-          <w:lang w:val="hr-HR"/>
-        </w:rPr>
-      </w:pPr>
-      <w:r>
-        <w:rPr>
-          <w:lang w:val="hr-HR"/>
-        </w:rPr>
-        <w:t>&lt;Ime i prezime studenta&gt;</w:t>
-      </w:r>
-    </w:p>
-    <w:p>
-      <w:pPr>
-        <w:pStyle w:val="BodyText"/>
-        <w:rPr>
-          <w:lang w:val="hr-HR"/>
-        </w:rPr>
-      </w:pPr>
-      <w:r>
-        <w:rPr>
-          <w:lang w:val="hr-HR"/>
-        </w:rPr>
-        <w:t>Jakov Ramljak</w:t>
-      </w:r>
-    </w:p>
-    <w:p>
-      <w:pPr>
-        <w:pStyle w:val="Heading1"/>
-        <w:rPr>
-          <w:lang w:val="hr-HR"/>
-        </w:rPr>
-      </w:pPr>
-      <w:r>
-        <w:rPr>
-          <w:lang w:val="hr-HR"/>
-        </w:rPr>
-        <w:tab/>
-      </w:r>
-      <w:bookmarkStart w:id="5" w:name="_Toc179182959"/>
-      <w:r>
-        <w:rPr>
-          <w:lang w:val="hr-HR"/>
-        </w:rPr>
-        <w:t>Rezultat(i)</w:t>
-      </w:r>
-      <w:bookmarkEnd w:id="5"/>
-    </w:p>
-    <w:p>
-      <w:pPr>
-        <w:pStyle w:val="InfoBlue"/>
-        <w:rPr>
-          <w:lang w:val="hr-HR"/>
-        </w:rPr>
-      </w:pPr>
-      <w:r>
-        <w:rPr>
-          <w:lang w:val="hr-HR"/>
-        </w:rPr>
-        <w:t>[Navesti što će se isporučiti na kraju projekta, voditi računa da osim rezultata u vidu nekog proizvoda ovdje treba navesti i svu dokumentaciju.]</w:t>
-      </w:r>
-    </w:p>
-    <w:p>
-      <w:pPr>
-        <w:pStyle w:val="BodyText"/>
-        <w:rPr>
-          <w:lang w:val="hr-HR"/>
-        </w:rPr>
-      </w:pPr>
-      <w:r>
-        <w:rPr>
-          <w:lang w:val="hr-HR"/>
-        </w:rPr>
-        <w:t>Funkcionalna igra Dron.co</w:t>
-      </w:r>
-    </w:p>
-    <w:p>
-      <w:pPr>
-        <w:pStyle w:val="BodyText"/>
-        <w:rPr>
-          <w:lang w:val="hr-HR"/>
-        </w:rPr>
-      </w:pPr>
-      <w:r>
-        <w:rPr>
-          <w:lang w:val="hr-HR"/>
-        </w:rPr>
-        <w:t>3D modeli elemenata grada, drona, paketa</w:t>
-      </w:r>
-    </w:p>
-    <w:p>
-      <w:pPr>
-        <w:pStyle w:val="BodyText"/>
-        <w:rPr>
-          <w:lang w:val="hr-HR"/>
-        </w:rPr>
-      </w:pPr>
-      <w:r>
-        <w:rPr>
-          <w:lang w:val="hr-HR"/>
-        </w:rPr>
-        <w:t>Odrađeni plan projekta, tehnička dokumentacija te vizualna i interaktivna prezentacija projekta</w:t>
-      </w:r>
-    </w:p>
-    <w:p>
-      <w:pPr>
-        <w:pStyle w:val="BodyText"/>
-        <w:rPr>
-          <w:lang w:val="hr-HR"/>
-        </w:rPr>
-      </w:pPr>
-    </w:p>
-    <w:p>
-      <w:pPr>
-        <w:pStyle w:val="Heading1"/>
-        <w:rPr>
-          <w:lang w:val="hr-HR"/>
-        </w:rPr>
-      </w:pPr>
-      <w:bookmarkStart w:id="6" w:name="_Toc179182960"/>
-      <w:r>
-        <w:rPr>
-          <w:lang w:val="hr-HR"/>
-        </w:rPr>
-        <w:t>Slični projekti</w:t>
-      </w:r>
-      <w:bookmarkEnd w:id="6"/>
-    </w:p>
-    <w:p>
-      <w:pPr>
-        <w:pStyle w:val="InfoBlue"/>
-        <w:rPr>
-          <w:lang w:val="hr-HR"/>
-        </w:rPr>
-      </w:pPr>
-      <w:r>
-        <w:rPr>
-          <w:lang w:val="hr-HR"/>
-        </w:rPr>
-        <w:t xml:space="preserve">[Navesti projekte koji su povezani s dotičnim projektom.] </w:t>
-      </w:r>
-    </w:p>
-    <w:p>
-      <w:pPr>
-        <w:pStyle w:val="BodyText"/>
-        <w:rPr>
-          <w:lang w:val="hr-HR"/>
-        </w:rPr>
-      </w:pPr>
-      <w:r>
-        <w:rPr>
-          <w:lang w:val="hr-HR"/>
-        </w:rPr>
-        <w:t>(po dogovoru)</w:t>
-      </w:r>
-    </w:p>
-    <w:p>
-      <w:pPr>
-        <w:pStyle w:val="BodyText"/>
-        <w:rPr>
-          <w:lang w:val="hr-HR"/>
-        </w:rPr>
-      </w:pPr>
-    </w:p>
-    <w:p>
-      <w:pPr>
-        <w:pStyle w:val="Heading1"/>
+        <w:numPr>
+          <w:ilvl w:val="0"/>
+          <w:numId w:val="5"/>
+        </w:numPr>
         <w:rPr>
           <w:lang w:val="hr-HR"/>
         </w:rPr>
@@ -1287,14 +1277,8 @@
     <w:p>
       <w:pPr>
         <w:pStyle w:val="InfoBlue"/>
-        <w:rPr>
-          <w:lang w:val="hr-HR"/>
-        </w:rPr>
-      </w:pPr>
-      <w:r>
-        <w:rPr>
-          <w:lang w:val="hr-HR"/>
-        </w:rPr>
+      </w:pPr>
+      <w:r>
         <w:t>[Navesti ljudske i ostale resurse potrebne za uspješno dovršenje projekta. Popuniti tablicu raspoloživih članova tima s podacima važnim za projekt. Mogu se navesti znanja i vještine člana koje mogu biti od koristi za projekt, na primjer znanja Java-e, XML-a, iskustvo u radu s MS Projectom, sudjelovanje u sličnim projektima ili bilo kakva korisna informacija. Ako projekt koristi i druge resurse napraviti posebnu tablicu za njih. U kolonu Napomene treba upisati sve termine kad dotični član tima neće biti raspoloživ za rad na projektu (putovanja, odmori, odsustva).]</w:t>
       </w:r>
     </w:p>
@@ -1512,11 +1496,16 @@
             <w:pPr>
               <w:pStyle w:val="BodyText"/>
               <w:ind w:left="0"/>
-              <w:jc w:val="center"/>
-              <w:rPr>
-                <w:lang w:val="hr-HR"/>
-              </w:rPr>
-            </w:pPr>
+              <w:rPr>
+                <w:lang w:val="hr-HR"/>
+              </w:rPr>
+            </w:pPr>
+            <w:r>
+              <w:rPr>
+                <w:lang w:val="hr-HR"/>
+              </w:rPr>
+              <w:t>Voditelj, programiranje igara</w:t>
+            </w:r>
           </w:p>
         </w:tc>
       </w:tr>
@@ -1599,11 +1588,22 @@
             <w:pPr>
               <w:pStyle w:val="BodyText"/>
               <w:ind w:left="0"/>
-              <w:jc w:val="center"/>
-              <w:rPr>
-                <w:lang w:val="hr-HR"/>
-              </w:rPr>
-            </w:pPr>
+              <w:rPr>
+                <w:lang w:val="en-GB"/>
+              </w:rPr>
+            </w:pPr>
+            <w:r>
+              <w:rPr>
+                <w:lang w:val="hr-HR"/>
+              </w:rPr>
+              <w:t>Fizičke simulacije</w:t>
+            </w:r>
+            <w:r>
+              <w:rPr>
+                <w:lang w:val="hr-HR"/>
+              </w:rPr>
+              <w:t>, programiranje igara</w:t>
+            </w:r>
           </w:p>
         </w:tc>
       </w:tr>
@@ -1702,11 +1702,16 @@
             <w:pPr>
               <w:pStyle w:val="BodyText"/>
               <w:ind w:left="0"/>
-              <w:jc w:val="center"/>
-              <w:rPr>
-                <w:lang w:val="hr-HR"/>
-              </w:rPr>
-            </w:pPr>
+              <w:rPr>
+                <w:lang w:val="hr-HR"/>
+              </w:rPr>
+            </w:pPr>
+            <w:r>
+              <w:rPr>
+                <w:lang w:val="hr-HR"/>
+              </w:rPr>
+              <w:t>Fizičke simulacije</w:t>
+            </w:r>
           </w:p>
         </w:tc>
       </w:tr>
@@ -1789,11 +1794,30 @@
             <w:pPr>
               <w:pStyle w:val="BodyText"/>
               <w:ind w:left="0"/>
-              <w:jc w:val="center"/>
-              <w:rPr>
-                <w:lang w:val="hr-HR"/>
-              </w:rPr>
-            </w:pPr>
+              <w:rPr>
+                <w:lang w:val="hr-HR"/>
+              </w:rPr>
+            </w:pPr>
+            <w:r>
+              <w:rPr>
+                <w:lang w:val="hr-HR"/>
+              </w:rPr>
+              <w:t xml:space="preserve">Modeliranje u </w:t>
+            </w:r>
+            <w:r>
+              <w:rPr>
+                <w:i/>
+                <w:iCs/>
+                <w:lang w:val="hr-HR"/>
+              </w:rPr>
+              <w:t>Blenderu</w:t>
+            </w:r>
+            <w:r>
+              <w:rPr>
+                <w:lang w:val="hr-HR"/>
+              </w:rPr>
+              <w:t>, računalna grafika</w:t>
+            </w:r>
           </w:p>
         </w:tc>
       </w:tr>
@@ -1876,11 +1900,24 @@
             <w:pPr>
               <w:pStyle w:val="BodyText"/>
               <w:ind w:left="0"/>
-              <w:jc w:val="center"/>
-              <w:rPr>
-                <w:lang w:val="hr-HR"/>
-              </w:rPr>
-            </w:pPr>
+              <w:rPr>
+                <w:lang w:val="hr-HR"/>
+              </w:rPr>
+            </w:pPr>
+            <w:r>
+              <w:rPr>
+                <w:lang w:val="hr-HR"/>
+              </w:rPr>
+              <w:t xml:space="preserve">Modeliranje u </w:t>
+            </w:r>
+            <w:r>
+              <w:rPr>
+                <w:i/>
+                <w:iCs/>
+                <w:lang w:val="hr-HR"/>
+              </w:rPr>
+              <w:t>Blenderu</w:t>
+            </w:r>
           </w:p>
         </w:tc>
       </w:tr>
@@ -1888,6 +1925,10 @@
     <w:p>
       <w:pPr>
         <w:pStyle w:val="Heading1"/>
+        <w:numPr>
+          <w:ilvl w:val="0"/>
+          <w:numId w:val="5"/>
+        </w:numPr>
         <w:rPr>
           <w:lang w:val="hr-HR"/>
         </w:rPr>
@@ -1904,14 +1945,8 @@
     <w:p>
       <w:pPr>
         <w:pStyle w:val="InfoBlue"/>
-        <w:rPr>
-          <w:lang w:val="hr-HR"/>
-        </w:rPr>
-      </w:pPr>
-      <w:r>
-        <w:rPr>
-          <w:lang w:val="hr-HR"/>
-        </w:rPr>
+      </w:pPr>
+      <w:r>
         <w:t>[Navesti glavne zapreke za ostvarenje uspjeha projekta, te posljedice ukoliko projekt ne uspije.]</w:t>
       </w:r>
     </w:p>
@@ -2152,6 +2187,10 @@
     <w:p>
       <w:pPr>
         <w:pStyle w:val="Heading1"/>
+        <w:numPr>
+          <w:ilvl w:val="0"/>
+          <w:numId w:val="5"/>
+        </w:numPr>
         <w:rPr>
           <w:lang w:val="hr-HR"/>
         </w:rPr>
@@ -2168,14 +2207,8 @@
     <w:p>
       <w:pPr>
         <w:pStyle w:val="InfoBlue"/>
-        <w:rPr>
-          <w:lang w:val="hr-HR"/>
-        </w:rPr>
-      </w:pPr>
-      <w:r>
-        <w:rPr>
-          <w:lang w:val="hr-HR"/>
-        </w:rPr>
+      </w:pPr>
+      <w:r>
         <w:t>[Navesti korake koji će se poduzeti kako bi se što je moguće više umanjio svaki od prethodno navedenih rizika.]</w:t>
       </w:r>
     </w:p>
@@ -2285,25 +2318,26 @@
     </w:p>
     <w:p>
       <w:pPr>
-        <w:pStyle w:val="BodyText"/>
-        <w:ind w:left="0"/>
-        <w:rPr>
-          <w:lang w:val="hr-HR"/>
-        </w:rPr>
-      </w:pPr>
-    </w:p>
-    <w:p>
-      <w:pPr>
-        <w:pStyle w:val="BodyText"/>
-        <w:ind w:left="0"/>
-        <w:rPr>
-          <w:lang w:val="hr-HR"/>
-        </w:rPr>
-      </w:pPr>
+        <w:widowControl/>
+        <w:spacing w:line="240" w:lineRule="auto"/>
+        <w:rPr>
+          <w:lang w:val="hr-HR"/>
+        </w:rPr>
+      </w:pPr>
+      <w:r>
+        <w:rPr>
+          <w:lang w:val="hr-HR"/>
+        </w:rPr>
+        <w:br w:type="page"/>
+      </w:r>
     </w:p>
     <w:p>
       <w:pPr>
         <w:pStyle w:val="Heading1"/>
+        <w:numPr>
+          <w:ilvl w:val="0"/>
+          <w:numId w:val="5"/>
+        </w:numPr>
         <w:rPr>
           <w:lang w:val="hr-HR"/>
         </w:rPr>
@@ -2323,14 +2357,8 @@
     <w:p>
       <w:pPr>
         <w:pStyle w:val="InfoBlue"/>
-        <w:rPr>
-          <w:lang w:val="hr-HR"/>
-        </w:rPr>
-      </w:pPr>
-      <w:r>
-        <w:rPr>
-          <w:lang w:val="hr-HR"/>
-        </w:rPr>
+      </w:pPr>
+      <w:r>
         <w:t>[Navesti glavne faze projekta, te ukratko objašnjenje po kojem načelu je projekt podijeljen na te faze- vremenska organizacija, smanjenje rizika, raspoloživost resursa i/ili nešto drugo.]</w:t>
       </w:r>
     </w:p>
@@ -2349,7 +2377,67 @@
         <w:rPr>
           <w:lang w:val="hr-HR"/>
         </w:rPr>
-        <w:t xml:space="preserve">Faza: planiranje projekta i analiza potrebnih resursa, funkcionalnih zahtjeva </w:t>
+        <w:t>Faza: planiranje projekta</w:t>
+      </w:r>
+    </w:p>
+    <w:p>
+      <w:pPr>
+        <w:pStyle w:val="BodyText"/>
+        <w:numPr>
+          <w:ilvl w:val="1"/>
+          <w:numId w:val="3"/>
+        </w:numPr>
+        <w:rPr>
+          <w:lang w:val="hr-HR"/>
+        </w:rPr>
+      </w:pPr>
+      <w:r>
+        <w:rPr>
+          <w:lang w:val="hr-HR"/>
+        </w:rPr>
+        <w:t>analiza potrebnih resursa</w:t>
+      </w:r>
+    </w:p>
+    <w:p>
+      <w:pPr>
+        <w:pStyle w:val="BodyText"/>
+        <w:numPr>
+          <w:ilvl w:val="1"/>
+          <w:numId w:val="3"/>
+        </w:numPr>
+        <w:rPr>
+          <w:lang w:val="hr-HR"/>
+        </w:rPr>
+      </w:pPr>
+      <w:r>
+        <w:rPr>
+          <w:lang w:val="hr-HR"/>
+        </w:rPr>
+        <w:t xml:space="preserve">određivanje </w:t>
+      </w:r>
+      <w:r>
+        <w:rPr>
+          <w:lang w:val="hr-HR"/>
+        </w:rPr>
+        <w:t>funkcionalni</w:t>
+      </w:r>
+      <w:r>
+        <w:rPr>
+          <w:lang w:val="hr-HR"/>
+        </w:rPr>
+        <w:t>h</w:t>
+      </w:r>
+      <w:r>
+        <w:rPr>
+          <w:lang w:val="hr-HR"/>
+        </w:rPr>
+        <w:t xml:space="preserve"> zahtjev</w:t>
+      </w:r>
+      <w:r>
+        <w:rPr>
+          <w:lang w:val="hr-HR"/>
+        </w:rPr>
+        <w:t>a</w:t>
       </w:r>
     </w:p>
     <w:p>
@@ -2385,7 +2473,13 @@
         <w:rPr>
           <w:lang w:val="hr-HR"/>
         </w:rPr>
-        <w:t>Faza: razvoj fizike igre te nje same u Godotu i spajanje kontrolera, paralelno 3D modeliranje drona i grada</w:t>
+        <w:t xml:space="preserve">Faza: razvoj </w:t>
+      </w:r>
+      <w:r>
+        <w:rPr>
+          <w:lang w:val="hr-HR"/>
+        </w:rPr>
+        <w:t>pojedinih aspekta projekta zasebno u paraleli</w:t>
       </w:r>
     </w:p>
     <w:p>
@@ -2403,7 +2497,27 @@
         <w:rPr>
           <w:lang w:val="hr-HR"/>
         </w:rPr>
-        <w:t>dron je u početku samo kocka prije modeliranja kako bi se ubrzao rad na funkcionalnostima</w:t>
+        <w:t xml:space="preserve">simulacija kontrole drona </w:t>
+      </w:r>
+      <w:r>
+        <w:rPr>
+          <w:lang w:val="hr-HR"/>
+        </w:rPr>
+        <w:t xml:space="preserve">u </w:t>
+      </w:r>
+      <w:r>
+        <w:rPr>
+          <w:i/>
+          <w:iCs/>
+          <w:lang w:val="hr-HR"/>
+        </w:rPr>
+        <w:t>Godotu</w:t>
+      </w:r>
+      <w:r>
+        <w:rPr>
+          <w:lang w:val="hr-HR"/>
+        </w:rPr>
+        <w:t xml:space="preserve"> i spajanje kontrolera</w:t>
       </w:r>
     </w:p>
     <w:p>
@@ -2421,7 +2535,33 @@
         <w:rPr>
           <w:lang w:val="hr-HR"/>
         </w:rPr>
-        <w:t>paralelno drugi tim radi na modeliranju 3D modela potrebnih za simulaciju</w:t>
+        <w:t>modeliranj</w:t>
+      </w:r>
+      <w:r>
+        <w:rPr>
+          <w:lang w:val="hr-HR"/>
+        </w:rPr>
+        <w:t>e</w:t>
+      </w:r>
+      <w:r>
+        <w:rPr>
+          <w:lang w:val="hr-HR"/>
+        </w:rPr>
+        <w:t xml:space="preserve"> 3D modela </w:t>
+      </w:r>
+      <w:r>
+        <w:rPr>
+          <w:lang w:val="hr-HR"/>
+        </w:rPr>
+        <w:t xml:space="preserve">drona i grada u </w:t>
+      </w:r>
+      <w:r>
+        <w:rPr>
+          <w:i/>
+          <w:iCs/>
+          <w:lang w:val="hr-HR"/>
+        </w:rPr>
+        <w:t>Blenderu</w:t>
       </w:r>
     </w:p>
     <w:p>
@@ -2439,7 +2579,15 @@
         <w:rPr>
           <w:lang w:val="hr-HR"/>
         </w:rPr>
-        <w:t>optimizacija vremena</w:t>
+        <w:t xml:space="preserve">razvoj funkcionalnosti elementa igranja u </w:t>
+      </w:r>
+      <w:r>
+        <w:rPr>
+          <w:i/>
+          <w:iCs/>
+          <w:lang w:val="hr-HR"/>
+        </w:rPr>
+        <w:t>Godotu</w:t>
       </w:r>
     </w:p>
     <w:p>
@@ -2457,7 +2605,13 @@
         <w:rPr>
           <w:lang w:val="hr-HR"/>
         </w:rPr>
-        <w:t>Faza: spajanje aspekata igre, importiranje 3D modela u Godot</w:t>
+        <w:t xml:space="preserve">Faza: spajanje aspekata </w:t>
+      </w:r>
+      <w:r>
+        <w:rPr>
+          <w:lang w:val="hr-HR"/>
+        </w:rPr>
+        <w:t>projekta</w:t>
       </w:r>
     </w:p>
     <w:p>
@@ -2475,7 +2629,19 @@
         <w:rPr>
           <w:lang w:val="hr-HR"/>
         </w:rPr>
-        <w:t>implementacija sve fizike, kontrola i logike igre</w:t>
+        <w:t>implementacija fizike, kontrol</w:t>
+      </w:r>
+      <w:r>
+        <w:rPr>
+          <w:lang w:val="hr-HR"/>
+        </w:rPr>
+        <w:t>e</w:t>
+      </w:r>
+      <w:r>
+        <w:rPr>
+          <w:lang w:val="hr-HR"/>
+        </w:rPr>
+        <w:t xml:space="preserve"> i logike igre</w:t>
       </w:r>
     </w:p>
     <w:p>
@@ -2493,7 +2659,19 @@
         <w:rPr>
           <w:lang w:val="hr-HR"/>
         </w:rPr>
-        <w:t>spajanje 3D modela i same igre</w:t>
+        <w:t>uvoz</w:t>
+      </w:r>
+      <w:r>
+        <w:rPr>
+          <w:lang w:val="hr-HR"/>
+        </w:rPr>
+        <w:t xml:space="preserve"> 3D modela u Godot</w:t>
+      </w:r>
+      <w:r>
+        <w:rPr>
+          <w:lang w:val="hr-HR"/>
+        </w:rPr>
+        <w:t xml:space="preserve"> </w:t>
       </w:r>
     </w:p>
     <w:p>
@@ -2529,7 +2707,7 @@
         <w:rPr>
           <w:lang w:val="hr-HR"/>
         </w:rPr>
-        <w:t>Faza: testiranje i optimizacija igre</w:t>
+        <w:t>Faza: testiranje i optimizacija</w:t>
       </w:r>
     </w:p>
     <w:p>
@@ -2624,7 +2802,35 @@
     </w:p>
     <w:p>
       <w:pPr>
+        <w:widowControl/>
+        <w:spacing w:line="240" w:lineRule="auto"/>
+        <w:rPr>
+          <w:lang w:val="hr-HR"/>
+        </w:rPr>
+      </w:pPr>
+      <w:r>
+        <w:rPr>
+          <w:lang w:val="hr-HR"/>
+        </w:rPr>
+        <w:br w:type="page"/>
+      </w:r>
+    </w:p>
+    <w:p>
+      <w:pPr>
+        <w:pStyle w:val="BodyText"/>
+        <w:ind w:left="1800"/>
+        <w:rPr>
+          <w:lang w:val="hr-HR"/>
+        </w:rPr>
+      </w:pPr>
+    </w:p>
+    <w:p>
+      <w:pPr>
         <w:pStyle w:val="Heading1"/>
+        <w:numPr>
+          <w:ilvl w:val="0"/>
+          <w:numId w:val="5"/>
+        </w:numPr>
         <w:rPr>
           <w:lang w:val="hr-HR"/>
         </w:rPr>
@@ -2656,14 +2862,8 @@
     <w:p>
       <w:pPr>
         <w:pStyle w:val="InfoBlue"/>
-        <w:rPr>
-          <w:lang w:val="hr-HR"/>
-        </w:rPr>
-      </w:pPr>
-      <w:r>
-        <w:rPr>
-          <w:lang w:val="hr-HR"/>
-        </w:rPr>
+      </w:pPr>
+      <w:r>
         <w:t>[Nacrtati WBS s navedenim aktivnostima projekta.]</w:t>
       </w:r>
     </w:p>
@@ -2674,24 +2874,11 @@
           <w:lang w:val="hr-HR"/>
         </w:rPr>
       </w:pPr>
-      <w:r>
-        <w:rPr>
-          <w:lang w:val="hr-HR"/>
-        </w:rPr>
-        <w:t>Slika (po dogovoru)</w:t>
-      </w:r>
     </w:p>
     <w:p>
       <w:pPr>
         <w:pStyle w:val="BodyText"/>
-        <w:rPr>
-          <w:lang w:val="hr-HR"/>
-        </w:rPr>
-      </w:pPr>
-    </w:p>
-    <w:p>
-      <w:pPr>
-        <w:pStyle w:val="BodyText"/>
+        <w:jc w:val="center"/>
         <w:rPr>
           <w:lang w:val="hr-HR"/>
         </w:rPr>
@@ -2701,10 +2888,9 @@
           <w:noProof/>
           <w:lang w:val="hr-HR"/>
         </w:rPr>
-        <w:lastRenderedPageBreak/>
         <w:drawing>
-          <wp:inline distT="0" distB="0" distL="0" distR="0" wp14:anchorId="04C94521" wp14:editId="6D566A02">
-            <wp:extent cx="4858247" cy="3673790"/>
+          <wp:inline distT="0" distB="0" distL="0" distR="0" wp14:anchorId="04C94521" wp14:editId="4D5C8605">
+            <wp:extent cx="4943249" cy="3738067"/>
             <wp:effectExtent l="0" t="0" r="0" b="0"/>
             <wp:docPr id="1321176650" name="Picture 4" descr="A screen shot of a computer&#10;&#10;AI-generated content may be incorrect."/>
             <wp:cNvGraphicFramePr>
@@ -2732,7 +2918,7 @@
                   <pic:spPr>
                     <a:xfrm>
                       <a:off x="0" y="0"/>
-                      <a:ext cx="4911044" cy="3713715"/>
+                      <a:ext cx="5064611" cy="3829840"/>
                     </a:xfrm>
                     <a:prstGeom prst="rect">
                       <a:avLst/>
@@ -2747,15 +2933,11 @@
     </w:p>
     <w:p>
       <w:pPr>
-        <w:pStyle w:val="BodyText"/>
-        <w:rPr>
-          <w:lang w:val="hr-HR"/>
-        </w:rPr>
-      </w:pPr>
-    </w:p>
-    <w:p>
-      <w:pPr>
         <w:pStyle w:val="Heading1"/>
+        <w:numPr>
+          <w:ilvl w:val="0"/>
+          <w:numId w:val="5"/>
+        </w:numPr>
         <w:rPr>
           <w:lang w:val="hr-HR"/>
         </w:rPr>
@@ -2792,14 +2974,8 @@
     <w:p>
       <w:pPr>
         <w:pStyle w:val="InfoBlue"/>
-        <w:rPr>
-          <w:lang w:val="hr-HR"/>
-        </w:rPr>
-      </w:pPr>
-      <w:r>
-        <w:rPr>
-          <w:lang w:val="hr-HR"/>
-        </w:rPr>
+      </w:pPr>
+      <w:r>
         <w:t>[Općenito, kontrolna točka projekta je događaj ili rezultat neke aktivnosti koji ukazuje na to je li projekt u skladu sa zadanim rokovima ili kasni. Ta informacija se upisuje u kolonu o statusu projekta. Ako projekt kasni moraju se poduzeti akcije da se rokovi dostignu. Za svaku kontrolnu točku treba odrediti točan datum. Po potrebi se mogu dodavati ili oduzimati redovi tablice.]</w:t>
       </w:r>
     </w:p>
@@ -2828,10 +3004,10 @@
         <w:tblLook w:val="01E0" w:firstRow="1" w:lastRow="1" w:firstColumn="1" w:lastColumn="1" w:noHBand="0" w:noVBand="0"/>
       </w:tblPr>
       <w:tblGrid>
-        <w:gridCol w:w="2367"/>
-        <w:gridCol w:w="1259"/>
-        <w:gridCol w:w="2391"/>
-        <w:gridCol w:w="2332"/>
+        <w:gridCol w:w="3181"/>
+        <w:gridCol w:w="1276"/>
+        <w:gridCol w:w="1275"/>
+        <w:gridCol w:w="2617"/>
       </w:tblGrid>
       <w:tr>
         <w:trPr>
@@ -2839,13 +3015,13 @@
         </w:trPr>
         <w:tc>
           <w:tcPr>
-            <w:tcW w:w="2366" w:type="dxa"/>
+            <w:tcW w:w="3181" w:type="dxa"/>
             <w:vAlign w:val="center"/>
           </w:tcPr>
           <w:p>
             <w:pPr>
               <w:pStyle w:val="BodyText"/>
-              <w:spacing w:after="0"/>
+              <w:spacing w:after="0" w:line="240" w:lineRule="auto"/>
               <w:ind w:left="0"/>
               <w:jc w:val="center"/>
               <w:rPr>
@@ -2864,13 +3040,13 @@
         </w:tc>
         <w:tc>
           <w:tcPr>
-            <w:tcW w:w="1259" w:type="dxa"/>
+            <w:tcW w:w="1276" w:type="dxa"/>
             <w:vAlign w:val="center"/>
           </w:tcPr>
           <w:p>
             <w:pPr>
               <w:pStyle w:val="BodyText"/>
-              <w:spacing w:after="0"/>
+              <w:spacing w:after="0" w:line="240" w:lineRule="auto"/>
               <w:ind w:left="0"/>
               <w:jc w:val="center"/>
               <w:rPr>
@@ -2889,13 +3065,13 @@
         </w:tc>
         <w:tc>
           <w:tcPr>
-            <w:tcW w:w="2391" w:type="dxa"/>
+            <w:tcW w:w="1275" w:type="dxa"/>
             <w:vAlign w:val="center"/>
           </w:tcPr>
           <w:p>
             <w:pPr>
               <w:pStyle w:val="BodyText"/>
-              <w:spacing w:after="0"/>
+              <w:spacing w:after="0" w:line="240" w:lineRule="auto"/>
               <w:ind w:left="0"/>
               <w:jc w:val="center"/>
               <w:rPr>
@@ -2914,13 +3090,13 @@
         </w:tc>
         <w:tc>
           <w:tcPr>
-            <w:tcW w:w="2332" w:type="dxa"/>
+            <w:tcW w:w="2617" w:type="dxa"/>
             <w:vAlign w:val="center"/>
           </w:tcPr>
           <w:p>
             <w:pPr>
               <w:pStyle w:val="BodyText"/>
-              <w:spacing w:after="0"/>
+              <w:spacing w:after="0" w:line="240" w:lineRule="auto"/>
               <w:ind w:left="0"/>
               <w:jc w:val="center"/>
               <w:rPr>
@@ -2935,6 +3111,213 @@
               </w:rPr>
               <w:t>Status projekta</w:t>
             </w:r>
+          </w:p>
+        </w:tc>
+      </w:tr>
+      <w:tr>
+        <w:trPr>
+          <w:trHeight w:val="333"/>
+          <w:jc w:val="center"/>
+        </w:trPr>
+        <w:tc>
+          <w:tcPr>
+            <w:tcW w:w="3181" w:type="dxa"/>
+            <w:vAlign w:val="center"/>
+          </w:tcPr>
+          <w:p>
+            <w:pPr>
+              <w:pStyle w:val="BodyText"/>
+              <w:spacing w:after="0" w:line="240" w:lineRule="auto"/>
+              <w:ind w:left="0"/>
+              <w:rPr>
+                <w:bCs/>
+                <w:lang w:val="hr-HR"/>
+              </w:rPr>
+            </w:pPr>
+            <w:r>
+              <w:rPr>
+                <w:bCs/>
+                <w:lang w:val="hr-HR"/>
+              </w:rPr>
+              <w:t>Određena tema projekta</w:t>
+            </w:r>
+          </w:p>
+        </w:tc>
+        <w:tc>
+          <w:tcPr>
+            <w:tcW w:w="1276" w:type="dxa"/>
+            <w:vAlign w:val="center"/>
+          </w:tcPr>
+          <w:p>
+            <w:pPr>
+              <w:pStyle w:val="BodyText"/>
+              <w:spacing w:after="0" w:line="240" w:lineRule="auto"/>
+              <w:ind w:left="0"/>
+              <w:jc w:val="center"/>
+              <w:rPr>
+                <w:bCs/>
+                <w:lang w:val="hr-HR"/>
+              </w:rPr>
+            </w:pPr>
+            <w:r>
+              <w:rPr>
+                <w:bCs/>
+                <w:lang w:val="hr-HR"/>
+              </w:rPr>
+              <w:t>14.10.2025.</w:t>
+            </w:r>
+          </w:p>
+        </w:tc>
+        <w:tc>
+          <w:tcPr>
+            <w:tcW w:w="1275" w:type="dxa"/>
+            <w:vAlign w:val="center"/>
+          </w:tcPr>
+          <w:p>
+            <w:pPr>
+              <w:pStyle w:val="BodyText"/>
+              <w:spacing w:after="0" w:line="240" w:lineRule="auto"/>
+              <w:ind w:left="0"/>
+              <w:jc w:val="center"/>
+              <w:rPr>
+                <w:bCs/>
+                <w:lang w:val="hr-HR"/>
+              </w:rPr>
+            </w:pPr>
+            <w:r>
+              <w:rPr>
+                <w:bCs/>
+                <w:lang w:val="hr-HR"/>
+              </w:rPr>
+              <w:t>14.10.2025.</w:t>
+            </w:r>
+          </w:p>
+        </w:tc>
+        <w:tc>
+          <w:tcPr>
+            <w:tcW w:w="2617" w:type="dxa"/>
+            <w:vAlign w:val="center"/>
+          </w:tcPr>
+          <w:p>
+            <w:pPr>
+              <w:pStyle w:val="BodyText"/>
+              <w:spacing w:after="0" w:line="240" w:lineRule="auto"/>
+              <w:ind w:left="0"/>
+              <w:jc w:val="center"/>
+              <w:rPr>
+                <w:bCs/>
+                <w:lang w:val="hr-HR"/>
+              </w:rPr>
+            </w:pPr>
+            <w:r>
+              <w:rPr>
+                <w:lang w:val="hr-HR"/>
+              </w:rPr>
+              <w:t>projekt je pokrenut</w:t>
+            </w:r>
+          </w:p>
+        </w:tc>
+      </w:tr>
+      <w:tr>
+        <w:trPr>
+          <w:trHeight w:val="269"/>
+          <w:jc w:val="center"/>
+        </w:trPr>
+        <w:tc>
+          <w:tcPr>
+            <w:tcW w:w="3181" w:type="dxa"/>
+            <w:vAlign w:val="center"/>
+          </w:tcPr>
+          <w:p>
+            <w:pPr>
+              <w:pStyle w:val="BodyText"/>
+              <w:spacing w:line="240" w:lineRule="auto"/>
+              <w:ind w:left="0"/>
+              <w:rPr>
+                <w:lang w:val="hr-HR"/>
+              </w:rPr>
+            </w:pPr>
+            <w:r>
+              <w:rPr>
+                <w:lang w:val="hr-HR"/>
+              </w:rPr>
+              <w:t>Određen plan projekta</w:t>
+            </w:r>
+          </w:p>
+        </w:tc>
+        <w:tc>
+          <w:tcPr>
+            <w:tcW w:w="1276" w:type="dxa"/>
+            <w:vAlign w:val="center"/>
+          </w:tcPr>
+          <w:p>
+            <w:pPr>
+              <w:pStyle w:val="BodyText"/>
+              <w:spacing w:line="240" w:lineRule="auto"/>
+              <w:ind w:left="0"/>
+              <w:jc w:val="center"/>
+              <w:rPr>
+                <w:lang w:val="hr-HR"/>
+              </w:rPr>
+            </w:pPr>
+            <w:r>
+              <w:rPr>
+                <w:lang w:val="hr-HR"/>
+              </w:rPr>
+              <w:t>14</w:t>
+            </w:r>
+            <w:r>
+              <w:rPr>
+                <w:lang w:val="hr-HR"/>
+              </w:rPr>
+              <w:t>.</w:t>
+            </w:r>
+            <w:r>
+              <w:rPr>
+                <w:lang w:val="hr-HR"/>
+              </w:rPr>
+              <w:t>11</w:t>
+            </w:r>
+            <w:r>
+              <w:rPr>
+                <w:lang w:val="hr-HR"/>
+              </w:rPr>
+              <w:t>.2025.</w:t>
+            </w:r>
+          </w:p>
+        </w:tc>
+        <w:tc>
+          <w:tcPr>
+            <w:tcW w:w="1275" w:type="dxa"/>
+            <w:vAlign w:val="center"/>
+          </w:tcPr>
+          <w:p>
+            <w:pPr>
+              <w:pStyle w:val="BodyText"/>
+              <w:spacing w:line="240" w:lineRule="auto"/>
+              <w:ind w:left="0"/>
+              <w:jc w:val="center"/>
+              <w:rPr>
+                <w:lang w:val="hr-HR"/>
+              </w:rPr>
+            </w:pPr>
+          </w:p>
+        </w:tc>
+        <w:tc>
+          <w:tcPr>
+            <w:tcW w:w="2617" w:type="dxa"/>
+            <w:vAlign w:val="center"/>
+          </w:tcPr>
+          <w:p>
+            <w:pPr>
+              <w:pStyle w:val="BodyText"/>
+              <w:spacing w:line="240" w:lineRule="auto"/>
+              <w:ind w:left="0"/>
+              <w:jc w:val="center"/>
+              <w:rPr>
+                <w:lang w:val="hr-HR"/>
+              </w:rPr>
+            </w:pPr>
           </w:p>
         </w:tc>
       </w:tr>
@@ -2944,12 +3327,35 @@
         </w:trPr>
         <w:tc>
           <w:tcPr>
-            <w:tcW w:w="2366" w:type="dxa"/>
+            <w:tcW w:w="3181" w:type="dxa"/>
             <w:vAlign w:val="center"/>
           </w:tcPr>
           <w:p>
             <w:pPr>
               <w:pStyle w:val="BodyText"/>
+              <w:spacing w:line="240" w:lineRule="auto"/>
+              <w:ind w:left="0"/>
+              <w:rPr>
+                <w:lang w:val="hr-HR"/>
+              </w:rPr>
+            </w:pPr>
+            <w:r>
+              <w:rPr>
+                <w:lang w:val="hr-HR"/>
+              </w:rPr>
+              <w:t xml:space="preserve">Implementirane kontrole </w:t>
+            </w:r>
+          </w:p>
+        </w:tc>
+        <w:tc>
+          <w:tcPr>
+            <w:tcW w:w="1276" w:type="dxa"/>
+            <w:vAlign w:val="center"/>
+          </w:tcPr>
+          <w:p>
+            <w:pPr>
+              <w:pStyle w:val="BodyText"/>
+              <w:spacing w:line="240" w:lineRule="auto"/>
               <w:ind w:left="0"/>
               <w:jc w:val="center"/>
               <w:rPr>
@@ -2960,74 +3366,42 @@
               <w:rPr>
                 <w:lang w:val="hr-HR"/>
               </w:rPr>
-              <w:t>Kraj planiranja projekta</w:t>
-            </w:r>
-          </w:p>
-        </w:tc>
-        <w:tc>
-          <w:tcPr>
-            <w:tcW w:w="1259" w:type="dxa"/>
+              <w:t>11.11.2025.</w:t>
+            </w:r>
+          </w:p>
+        </w:tc>
+        <w:tc>
+          <w:tcPr>
+            <w:tcW w:w="1275" w:type="dxa"/>
             <w:vAlign w:val="center"/>
           </w:tcPr>
           <w:p>
             <w:pPr>
               <w:pStyle w:val="BodyText"/>
+              <w:spacing w:line="240" w:lineRule="auto"/>
               <w:ind w:left="0"/>
               <w:jc w:val="center"/>
               <w:rPr>
                 <w:lang w:val="hr-HR"/>
               </w:rPr>
             </w:pPr>
-            <w:r>
-              <w:rPr>
-                <w:lang w:val="hr-HR"/>
-              </w:rPr>
-              <w:t>20.10.2025.</w:t>
-            </w:r>
-          </w:p>
-        </w:tc>
-        <w:tc>
-          <w:tcPr>
-            <w:tcW w:w="2391" w:type="dxa"/>
+          </w:p>
+        </w:tc>
+        <w:tc>
+          <w:tcPr>
+            <w:tcW w:w="2617" w:type="dxa"/>
             <w:vAlign w:val="center"/>
           </w:tcPr>
           <w:p>
             <w:pPr>
               <w:pStyle w:val="BodyText"/>
+              <w:spacing w:line="240" w:lineRule="auto"/>
               <w:ind w:left="0"/>
               <w:jc w:val="center"/>
               <w:rPr>
                 <w:lang w:val="hr-HR"/>
               </w:rPr>
             </w:pPr>
-            <w:r>
-              <w:rPr>
-                <w:lang w:val="hr-HR"/>
-              </w:rPr>
-              <w:t>20.10.2025.</w:t>
-            </w:r>
-          </w:p>
-        </w:tc>
-        <w:tc>
-          <w:tcPr>
-            <w:tcW w:w="2332" w:type="dxa"/>
-            <w:vAlign w:val="center"/>
-          </w:tcPr>
-          <w:p>
-            <w:pPr>
-              <w:pStyle w:val="BodyText"/>
-              <w:ind w:left="0"/>
-              <w:jc w:val="center"/>
-              <w:rPr>
-                <w:lang w:val="hr-HR"/>
-              </w:rPr>
-            </w:pPr>
-            <w:r>
-              <w:rPr>
-                <w:lang w:val="hr-HR"/>
-              </w:rPr>
-              <w:t>projekt je pokrenut</w:t>
-            </w:r>
           </w:p>
         </w:tc>
       </w:tr>
@@ -3037,12 +3411,35 @@
         </w:trPr>
         <w:tc>
           <w:tcPr>
-            <w:tcW w:w="2366" w:type="dxa"/>
+            <w:tcW w:w="3181" w:type="dxa"/>
             <w:vAlign w:val="center"/>
           </w:tcPr>
           <w:p>
             <w:pPr>
               <w:pStyle w:val="BodyText"/>
+              <w:spacing w:line="240" w:lineRule="auto"/>
+              <w:ind w:left="0"/>
+              <w:rPr>
+                <w:lang w:val="hr-HR"/>
+              </w:rPr>
+            </w:pPr>
+            <w:r>
+              <w:rPr>
+                <w:lang w:val="hr-HR"/>
+              </w:rPr>
+              <w:t>Završeno modeliranje</w:t>
+            </w:r>
+          </w:p>
+        </w:tc>
+        <w:tc>
+          <w:tcPr>
+            <w:tcW w:w="1276" w:type="dxa"/>
+            <w:vAlign w:val="center"/>
+          </w:tcPr>
+          <w:p>
+            <w:pPr>
+              <w:pStyle w:val="BodyText"/>
+              <w:spacing w:line="240" w:lineRule="auto"/>
               <w:ind w:left="0"/>
               <w:jc w:val="center"/>
               <w:rPr>
@@ -3053,18 +3450,19 @@
               <w:rPr>
                 <w:lang w:val="hr-HR"/>
               </w:rPr>
-              <w:t xml:space="preserve">Implementirane kontrole </w:t>
-            </w:r>
-          </w:p>
-        </w:tc>
-        <w:tc>
-          <w:tcPr>
-            <w:tcW w:w="1259" w:type="dxa"/>
+              <w:t>14.12.2025.</w:t>
+            </w:r>
+          </w:p>
+        </w:tc>
+        <w:tc>
+          <w:tcPr>
+            <w:tcW w:w="1275" w:type="dxa"/>
             <w:vAlign w:val="center"/>
           </w:tcPr>
           <w:p>
             <w:pPr>
               <w:pStyle w:val="BodyText"/>
+              <w:spacing w:line="240" w:lineRule="auto"/>
               <w:ind w:left="0"/>
               <w:jc w:val="center"/>
               <w:rPr>
@@ -3075,28 +3473,13 @@
         </w:tc>
         <w:tc>
           <w:tcPr>
-            <w:tcW w:w="2391" w:type="dxa"/>
+            <w:tcW w:w="2617" w:type="dxa"/>
             <w:vAlign w:val="center"/>
           </w:tcPr>
           <w:p>
             <w:pPr>
               <w:pStyle w:val="BodyText"/>
-              <w:ind w:left="0"/>
-              <w:jc w:val="center"/>
-              <w:rPr>
-                <w:lang w:val="hr-HR"/>
-              </w:rPr>
-            </w:pPr>
-          </w:p>
-        </w:tc>
-        <w:tc>
-          <w:tcPr>
-            <w:tcW w:w="2332" w:type="dxa"/>
-            <w:vAlign w:val="center"/>
-          </w:tcPr>
-          <w:p>
-            <w:pPr>
-              <w:pStyle w:val="BodyText"/>
+              <w:spacing w:line="240" w:lineRule="auto"/>
               <w:ind w:left="0"/>
               <w:jc w:val="center"/>
               <w:rPr>
@@ -3112,12 +3495,41 @@
         </w:trPr>
         <w:tc>
           <w:tcPr>
-            <w:tcW w:w="2366" w:type="dxa"/>
+            <w:tcW w:w="3181" w:type="dxa"/>
+            <w:tcBorders>
+              <w:top w:val="nil"/>
+            </w:tcBorders>
             <w:vAlign w:val="center"/>
           </w:tcPr>
           <w:p>
             <w:pPr>
               <w:pStyle w:val="BodyText"/>
+              <w:spacing w:line="240" w:lineRule="auto"/>
+              <w:ind w:left="0"/>
+              <w:rPr>
+                <w:lang w:val="hr-HR"/>
+              </w:rPr>
+            </w:pPr>
+            <w:r>
+              <w:rPr>
+                <w:lang w:val="hr-HR"/>
+              </w:rPr>
+              <w:t>Završetak simulacija i efekta</w:t>
+            </w:r>
+          </w:p>
+        </w:tc>
+        <w:tc>
+          <w:tcPr>
+            <w:tcW w:w="1276" w:type="dxa"/>
+            <w:tcBorders>
+              <w:top w:val="nil"/>
+            </w:tcBorders>
+            <w:vAlign w:val="center"/>
+          </w:tcPr>
+          <w:p>
+            <w:pPr>
+              <w:pStyle w:val="BodyText"/>
+              <w:spacing w:line="240" w:lineRule="auto"/>
               <w:ind w:left="0"/>
               <w:jc w:val="center"/>
               <w:rPr>
@@ -3128,18 +3540,22 @@
               <w:rPr>
                 <w:lang w:val="hr-HR"/>
               </w:rPr>
-              <w:t>Završeno modeliranje grada i drona</w:t>
-            </w:r>
-          </w:p>
-        </w:tc>
-        <w:tc>
-          <w:tcPr>
-            <w:tcW w:w="1259" w:type="dxa"/>
+              <w:t>16.12.2025.</w:t>
+            </w:r>
+          </w:p>
+        </w:tc>
+        <w:tc>
+          <w:tcPr>
+            <w:tcW w:w="1275" w:type="dxa"/>
+            <w:tcBorders>
+              <w:top w:val="nil"/>
+            </w:tcBorders>
             <w:vAlign w:val="center"/>
           </w:tcPr>
           <w:p>
             <w:pPr>
               <w:pStyle w:val="BodyText"/>
+              <w:spacing w:line="240" w:lineRule="auto"/>
               <w:ind w:left="0"/>
               <w:jc w:val="center"/>
               <w:rPr>
@@ -3150,28 +3566,16 @@
         </w:tc>
         <w:tc>
           <w:tcPr>
-            <w:tcW w:w="2391" w:type="dxa"/>
+            <w:tcW w:w="2617" w:type="dxa"/>
+            <w:tcBorders>
+              <w:top w:val="nil"/>
+            </w:tcBorders>
             <w:vAlign w:val="center"/>
           </w:tcPr>
           <w:p>
             <w:pPr>
               <w:pStyle w:val="BodyText"/>
-              <w:ind w:left="0"/>
-              <w:jc w:val="center"/>
-              <w:rPr>
-                <w:lang w:val="hr-HR"/>
-              </w:rPr>
-            </w:pPr>
-          </w:p>
-        </w:tc>
-        <w:tc>
-          <w:tcPr>
-            <w:tcW w:w="2332" w:type="dxa"/>
-            <w:vAlign w:val="center"/>
-          </w:tcPr>
-          <w:p>
-            <w:pPr>
-              <w:pStyle w:val="BodyText"/>
+              <w:spacing w:line="240" w:lineRule="auto"/>
               <w:ind w:left="0"/>
               <w:jc w:val="center"/>
               <w:rPr>
@@ -3187,12 +3591,41 @@
         </w:trPr>
         <w:tc>
           <w:tcPr>
-            <w:tcW w:w="2366" w:type="dxa"/>
+            <w:tcW w:w="3181" w:type="dxa"/>
+            <w:tcBorders>
+              <w:top w:val="nil"/>
+            </w:tcBorders>
             <w:vAlign w:val="center"/>
           </w:tcPr>
           <w:p>
             <w:pPr>
               <w:pStyle w:val="BodyText"/>
+              <w:spacing w:line="240" w:lineRule="auto"/>
+              <w:ind w:left="0"/>
+              <w:rPr>
+                <w:lang w:val="hr-HR"/>
+              </w:rPr>
+            </w:pPr>
+            <w:r>
+              <w:rPr>
+                <w:lang w:val="hr-HR"/>
+              </w:rPr>
+              <w:t>Dizajniran tlocrt grada</w:t>
+            </w:r>
+          </w:p>
+        </w:tc>
+        <w:tc>
+          <w:tcPr>
+            <w:tcW w:w="1276" w:type="dxa"/>
+            <w:tcBorders>
+              <w:top w:val="nil"/>
+            </w:tcBorders>
+            <w:vAlign w:val="center"/>
+          </w:tcPr>
+          <w:p>
+            <w:pPr>
+              <w:pStyle w:val="BodyText"/>
+              <w:spacing w:line="240" w:lineRule="auto"/>
               <w:ind w:left="0"/>
               <w:jc w:val="center"/>
               <w:rPr>
@@ -3203,18 +3636,22 @@
               <w:rPr>
                 <w:lang w:val="hr-HR"/>
               </w:rPr>
-              <w:t xml:space="preserve">Implementirana fizika drona </w:t>
-            </w:r>
-          </w:p>
-        </w:tc>
-        <w:tc>
-          <w:tcPr>
-            <w:tcW w:w="1259" w:type="dxa"/>
+              <w:t>23.12.2025.</w:t>
+            </w:r>
+          </w:p>
+        </w:tc>
+        <w:tc>
+          <w:tcPr>
+            <w:tcW w:w="1275" w:type="dxa"/>
+            <w:tcBorders>
+              <w:top w:val="nil"/>
+            </w:tcBorders>
             <w:vAlign w:val="center"/>
           </w:tcPr>
           <w:p>
             <w:pPr>
               <w:pStyle w:val="BodyText"/>
+              <w:spacing w:line="240" w:lineRule="auto"/>
               <w:ind w:left="0"/>
               <w:jc w:val="center"/>
               <w:rPr>
@@ -3225,28 +3662,16 @@
         </w:tc>
         <w:tc>
           <w:tcPr>
-            <w:tcW w:w="2391" w:type="dxa"/>
+            <w:tcW w:w="2617" w:type="dxa"/>
+            <w:tcBorders>
+              <w:top w:val="nil"/>
+            </w:tcBorders>
             <w:vAlign w:val="center"/>
           </w:tcPr>
           <w:p>
             <w:pPr>
               <w:pStyle w:val="BodyText"/>
-              <w:ind w:left="0"/>
-              <w:jc w:val="center"/>
-              <w:rPr>
-                <w:lang w:val="hr-HR"/>
-              </w:rPr>
-            </w:pPr>
-          </w:p>
-        </w:tc>
-        <w:tc>
-          <w:tcPr>
-            <w:tcW w:w="2332" w:type="dxa"/>
-            <w:vAlign w:val="center"/>
-          </w:tcPr>
-          <w:p>
-            <w:pPr>
-              <w:pStyle w:val="BodyText"/>
+              <w:spacing w:line="240" w:lineRule="auto"/>
               <w:ind w:left="0"/>
               <w:jc w:val="center"/>
               <w:rPr>
@@ -3262,15 +3687,35 @@
         </w:trPr>
         <w:tc>
           <w:tcPr>
-            <w:tcW w:w="2366" w:type="dxa"/>
-            <w:tcBorders>
-              <w:top w:val="nil"/>
-            </w:tcBorders>
+            <w:tcW w:w="3181" w:type="dxa"/>
             <w:vAlign w:val="center"/>
           </w:tcPr>
           <w:p>
             <w:pPr>
               <w:pStyle w:val="BodyText"/>
+              <w:spacing w:line="240" w:lineRule="auto"/>
+              <w:ind w:left="0"/>
+              <w:rPr>
+                <w:lang w:val="hr-HR"/>
+              </w:rPr>
+            </w:pPr>
+            <w:r>
+              <w:rPr>
+                <w:lang w:val="hr-HR"/>
+              </w:rPr>
+              <w:t>Implementirana funkcionalnost igre</w:t>
+            </w:r>
+          </w:p>
+        </w:tc>
+        <w:tc>
+          <w:tcPr>
+            <w:tcW w:w="1276" w:type="dxa"/>
+            <w:vAlign w:val="center"/>
+          </w:tcPr>
+          <w:p>
+            <w:pPr>
+              <w:pStyle w:val="BodyText"/>
+              <w:spacing w:line="240" w:lineRule="auto"/>
               <w:ind w:left="0"/>
               <w:jc w:val="center"/>
               <w:rPr>
@@ -3281,21 +3726,19 @@
               <w:rPr>
                 <w:lang w:val="hr-HR"/>
               </w:rPr>
-              <w:t>Dizajniran tlocrt grada</w:t>
-            </w:r>
-          </w:p>
-        </w:tc>
-        <w:tc>
-          <w:tcPr>
-            <w:tcW w:w="1259" w:type="dxa"/>
-            <w:tcBorders>
-              <w:top w:val="nil"/>
-            </w:tcBorders>
+              <w:t>6.1.2026.</w:t>
+            </w:r>
+          </w:p>
+        </w:tc>
+        <w:tc>
+          <w:tcPr>
+            <w:tcW w:w="1275" w:type="dxa"/>
             <w:vAlign w:val="center"/>
           </w:tcPr>
           <w:p>
             <w:pPr>
               <w:pStyle w:val="BodyText"/>
+              <w:spacing w:line="240" w:lineRule="auto"/>
               <w:ind w:left="0"/>
               <w:jc w:val="center"/>
               <w:rPr>
@@ -3306,34 +3749,13 @@
         </w:tc>
         <w:tc>
           <w:tcPr>
-            <w:tcW w:w="2391" w:type="dxa"/>
-            <w:tcBorders>
-              <w:top w:val="nil"/>
-            </w:tcBorders>
+            <w:tcW w:w="2617" w:type="dxa"/>
             <w:vAlign w:val="center"/>
           </w:tcPr>
           <w:p>
             <w:pPr>
               <w:pStyle w:val="BodyText"/>
-              <w:ind w:left="0"/>
-              <w:jc w:val="center"/>
-              <w:rPr>
-                <w:lang w:val="hr-HR"/>
-              </w:rPr>
-            </w:pPr>
-          </w:p>
-        </w:tc>
-        <w:tc>
-          <w:tcPr>
-            <w:tcW w:w="2332" w:type="dxa"/>
-            <w:tcBorders>
-              <w:top w:val="nil"/>
-            </w:tcBorders>
-            <w:vAlign w:val="center"/>
-          </w:tcPr>
-          <w:p>
-            <w:pPr>
-              <w:pStyle w:val="BodyText"/>
+              <w:spacing w:line="240" w:lineRule="auto"/>
               <w:ind w:left="0"/>
               <w:jc w:val="center"/>
               <w:rPr>
@@ -3349,34 +3771,58 @@
         </w:trPr>
         <w:tc>
           <w:tcPr>
-            <w:tcW w:w="2366" w:type="dxa"/>
-            <w:tcBorders>
-              <w:top w:val="nil"/>
-            </w:tcBorders>
+            <w:tcW w:w="3181" w:type="dxa"/>
             <w:vAlign w:val="center"/>
           </w:tcPr>
           <w:p>
             <w:pPr>
               <w:pStyle w:val="BodyText"/>
+              <w:spacing w:line="240" w:lineRule="auto"/>
+              <w:ind w:left="0"/>
+              <w:rPr>
+                <w:lang w:val="hr-HR"/>
+              </w:rPr>
+            </w:pPr>
+            <w:r>
+              <w:rPr>
+                <w:lang w:val="hr-HR"/>
+              </w:rPr>
+              <w:t>Završetak dokumentacije projekta</w:t>
+            </w:r>
+          </w:p>
+        </w:tc>
+        <w:tc>
+          <w:tcPr>
+            <w:tcW w:w="1276" w:type="dxa"/>
+            <w:vAlign w:val="center"/>
+          </w:tcPr>
+          <w:p>
+            <w:pPr>
+              <w:pStyle w:val="BodyText"/>
+              <w:spacing w:line="240" w:lineRule="auto"/>
               <w:ind w:left="0"/>
               <w:jc w:val="center"/>
               <w:rPr>
                 <w:lang w:val="hr-HR"/>
               </w:rPr>
             </w:pPr>
-          </w:p>
-        </w:tc>
-        <w:tc>
-          <w:tcPr>
-            <w:tcW w:w="1259" w:type="dxa"/>
-            <w:tcBorders>
-              <w:top w:val="nil"/>
-            </w:tcBorders>
+            <w:r>
+              <w:rPr>
+                <w:lang w:val="hr-HR"/>
+              </w:rPr>
+              <w:t>23.1.2026.</w:t>
+            </w:r>
+          </w:p>
+        </w:tc>
+        <w:tc>
+          <w:tcPr>
+            <w:tcW w:w="1275" w:type="dxa"/>
             <w:vAlign w:val="center"/>
           </w:tcPr>
           <w:p>
             <w:pPr>
               <w:pStyle w:val="BodyText"/>
+              <w:spacing w:line="240" w:lineRule="auto"/>
               <w:ind w:left="0"/>
               <w:jc w:val="center"/>
               <w:rPr>
@@ -3387,190 +3833,13 @@
         </w:tc>
         <w:tc>
           <w:tcPr>
-            <w:tcW w:w="2391" w:type="dxa"/>
-            <w:tcBorders>
-              <w:top w:val="nil"/>
-            </w:tcBorders>
+            <w:tcW w:w="2617" w:type="dxa"/>
             <w:vAlign w:val="center"/>
           </w:tcPr>
           <w:p>
             <w:pPr>
               <w:pStyle w:val="BodyText"/>
-              <w:ind w:left="0"/>
-              <w:jc w:val="center"/>
-              <w:rPr>
-                <w:lang w:val="hr-HR"/>
-              </w:rPr>
-            </w:pPr>
-          </w:p>
-        </w:tc>
-        <w:tc>
-          <w:tcPr>
-            <w:tcW w:w="2332" w:type="dxa"/>
-            <w:tcBorders>
-              <w:top w:val="nil"/>
-            </w:tcBorders>
-            <w:vAlign w:val="center"/>
-          </w:tcPr>
-          <w:p>
-            <w:pPr>
-              <w:pStyle w:val="BodyText"/>
-              <w:ind w:left="0"/>
-              <w:jc w:val="center"/>
-              <w:rPr>
-                <w:lang w:val="hr-HR"/>
-              </w:rPr>
-            </w:pPr>
-          </w:p>
-        </w:tc>
-      </w:tr>
-      <w:tr>
-        <w:trPr>
-          <w:jc w:val="center"/>
-        </w:trPr>
-        <w:tc>
-          <w:tcPr>
-            <w:tcW w:w="2366" w:type="dxa"/>
-            <w:vAlign w:val="center"/>
-          </w:tcPr>
-          <w:p>
-            <w:pPr>
-              <w:pStyle w:val="BodyText"/>
-              <w:ind w:left="0"/>
-              <w:jc w:val="center"/>
-              <w:rPr>
-                <w:lang w:val="hr-HR"/>
-              </w:rPr>
-            </w:pPr>
-            <w:r>
-              <w:rPr>
-                <w:lang w:val="hr-HR"/>
-              </w:rPr>
-              <w:t>Integracija modela, fizike i logike u Godot</w:t>
-            </w:r>
-          </w:p>
-        </w:tc>
-        <w:tc>
-          <w:tcPr>
-            <w:tcW w:w="1259" w:type="dxa"/>
-            <w:vAlign w:val="center"/>
-          </w:tcPr>
-          <w:p>
-            <w:pPr>
-              <w:pStyle w:val="BodyText"/>
-              <w:ind w:left="0"/>
-              <w:jc w:val="center"/>
-              <w:rPr>
-                <w:lang w:val="hr-HR"/>
-              </w:rPr>
-            </w:pPr>
-          </w:p>
-        </w:tc>
-        <w:tc>
-          <w:tcPr>
-            <w:tcW w:w="2391" w:type="dxa"/>
-            <w:vAlign w:val="center"/>
-          </w:tcPr>
-          <w:p>
-            <w:pPr>
-              <w:pStyle w:val="BodyText"/>
-              <w:ind w:left="0"/>
-              <w:jc w:val="center"/>
-              <w:rPr>
-                <w:lang w:val="hr-HR"/>
-              </w:rPr>
-            </w:pPr>
-          </w:p>
-        </w:tc>
-        <w:tc>
-          <w:tcPr>
-            <w:tcW w:w="2332" w:type="dxa"/>
-            <w:vAlign w:val="center"/>
-          </w:tcPr>
-          <w:p>
-            <w:pPr>
-              <w:pStyle w:val="BodyText"/>
-              <w:ind w:left="0"/>
-              <w:jc w:val="center"/>
-              <w:rPr>
-                <w:lang w:val="hr-HR"/>
-              </w:rPr>
-            </w:pPr>
-          </w:p>
-        </w:tc>
-      </w:tr>
-      <w:tr>
-        <w:trPr>
-          <w:jc w:val="center"/>
-        </w:trPr>
-        <w:tc>
-          <w:tcPr>
-            <w:tcW w:w="2366" w:type="dxa"/>
-            <w:vAlign w:val="center"/>
-          </w:tcPr>
-          <w:p>
-            <w:pPr>
-              <w:pStyle w:val="BodyText"/>
-              <w:ind w:left="0"/>
-              <w:jc w:val="center"/>
-              <w:rPr>
-                <w:lang w:val="hr-HR"/>
-              </w:rPr>
-            </w:pPr>
-            <w:r>
-              <w:rPr>
-                <w:lang w:val="hr-HR"/>
-              </w:rPr>
-              <w:t>Odrađena završna testiranja</w:t>
-            </w:r>
-          </w:p>
-        </w:tc>
-        <w:tc>
-          <w:tcPr>
-            <w:tcW w:w="1259" w:type="dxa"/>
-            <w:vAlign w:val="center"/>
-          </w:tcPr>
-          <w:p>
-            <w:pPr>
-              <w:pStyle w:val="BodyText"/>
-              <w:ind w:left="0"/>
-              <w:jc w:val="center"/>
-              <w:rPr>
-                <w:lang w:val="hr-HR"/>
-              </w:rPr>
-            </w:pPr>
-            <w:r>
-              <w:rPr>
-                <w:lang w:val="hr-HR"/>
-              </w:rPr>
-              <w:t>23.1.2026.</w:t>
-            </w:r>
-          </w:p>
-        </w:tc>
-        <w:tc>
-          <w:tcPr>
-            <w:tcW w:w="2391" w:type="dxa"/>
-            <w:vAlign w:val="center"/>
-          </w:tcPr>
-          <w:p>
-            <w:pPr>
-              <w:pStyle w:val="BodyText"/>
-              <w:ind w:left="0"/>
-              <w:jc w:val="center"/>
-              <w:rPr>
-                <w:lang w:val="hr-HR"/>
-              </w:rPr>
-            </w:pPr>
-          </w:p>
-        </w:tc>
-        <w:tc>
-          <w:tcPr>
-            <w:tcW w:w="2332" w:type="dxa"/>
-            <w:vAlign w:val="center"/>
-          </w:tcPr>
-          <w:p>
-            <w:pPr>
-              <w:pStyle w:val="BodyText"/>
+              <w:spacing w:line="240" w:lineRule="auto"/>
               <w:ind w:left="0"/>
               <w:jc w:val="center"/>
               <w:rPr>
@@ -3590,7 +3859,33 @@
     </w:p>
     <w:p>
       <w:pPr>
+        <w:widowControl/>
+        <w:spacing w:line="240" w:lineRule="auto"/>
+        <w:rPr>
+          <w:lang w:val="hr-HR"/>
+        </w:rPr>
+      </w:pPr>
+      <w:r>
+        <w:rPr>
+          <w:lang w:val="hr-HR"/>
+        </w:rPr>
+        <w:br w:type="page"/>
+      </w:r>
+    </w:p>
+    <w:p>
+      <w:pPr>
+        <w:rPr>
+          <w:lang w:val="hr-HR"/>
+        </w:rPr>
+      </w:pPr>
+    </w:p>
+    <w:p>
+      <w:pPr>
         <w:pStyle w:val="Heading1"/>
+        <w:numPr>
+          <w:ilvl w:val="0"/>
+          <w:numId w:val="5"/>
+        </w:numPr>
         <w:rPr>
           <w:lang w:val="hr-HR"/>
         </w:rPr>
@@ -3600,7 +3895,6 @@
         <w:rPr>
           <w:lang w:val="hr-HR"/>
         </w:rPr>
-        <w:lastRenderedPageBreak/>
         <w:t>Gantogram</w:t>
       </w:r>
       <w:bookmarkEnd w:id="16"/>
@@ -3608,24 +3902,9 @@
     <w:p>
       <w:pPr>
         <w:pStyle w:val="InfoBlue"/>
-        <w:rPr>
-          <w:lang w:val="hr-HR"/>
-        </w:rPr>
-      </w:pPr>
-      <w:r>
-        <w:rPr>
-          <w:lang w:val="hr-HR"/>
-        </w:rPr>
-        <w:t xml:space="preserve">[Izraditi Gantogram pomoću programa MS Project, Open Workbench, Microsoft Excel - </w:t>
-      </w:r>
-      <w:r>
-        <w:t>http://office.microsoft.com/hr-hr/excel/HA010346051050.aspx,</w:t>
-      </w:r>
-      <w:r>
-        <w:rPr>
-          <w:lang w:val="hr-HR"/>
-        </w:rPr>
-        <w:t xml:space="preserve"> i sl. Pohraniti prikaz Gantograma (screenshot) i postaviti ga unutar ovog poglavlja kao ubačenu sliku.]</w:t>
+      </w:pPr>
+      <w:r>
+        <w:t>[Izraditi Gantogram pomoću programa MS Project, Open Workbench, Microsoft Excel - http://office.microsoft.com/hr-hr/excel/HA010346051050.aspx, i sl. Pohraniti prikaz Gantograma (screenshot) i postaviti ga unutar ovog poglavlja kao ubačenu sliku.]</w:t>
       </w:r>
     </w:p>
     <w:p>
@@ -3635,38 +3914,20 @@
           <w:lang w:val="hr-HR"/>
         </w:rPr>
       </w:pPr>
-      <w:r>
-        <w:rPr>
-          <w:lang w:val="hr-HR"/>
-        </w:rPr>
-        <w:t>Slika (po dogovoru)</w:t>
-      </w:r>
-    </w:p>
-    <w:p>
-      <w:pPr>
-        <w:pStyle w:val="BodyText"/>
-        <w:rPr>
-          <w:lang w:val="hr-HR"/>
-        </w:rPr>
-      </w:pPr>
-    </w:p>
-    <w:p>
-      <w:pPr>
-        <w:pStyle w:val="BodyText"/>
-        <w:rPr>
-          <w:lang w:val="hr-HR"/>
-        </w:rPr>
+    </w:p>
+    <w:p>
+      <w:pPr>
+        <w:pStyle w:val="InfoBlue"/>
       </w:pPr>
       <w:r>
         <w:rPr>
           <w:noProof/>
-          <w:lang w:val="hr-HR"/>
         </w:rPr>
         <w:drawing>
-          <wp:inline distT="0" distB="0" distL="0" distR="0" wp14:anchorId="11991650" wp14:editId="0A30D504">
-            <wp:extent cx="5339390" cy="3096962"/>
+          <wp:inline distT="0" distB="0" distL="0" distR="0" wp14:anchorId="11991650" wp14:editId="49FEAE0D">
+            <wp:extent cx="6196406" cy="3862426"/>
             <wp:effectExtent l="0" t="0" r="0" b="0"/>
-            <wp:docPr id="1425045899" name="Picture 2" descr="A screenshot of a computer program&#10;&#10;AI-generated content may be incorrect."/>
+            <wp:docPr id="1425045899" name="Picture 2"/>
             <wp:cNvGraphicFramePr>
               <a:graphicFrameLocks xmlns:a="http://schemas.openxmlformats.org/drawingml/2006/main" noChangeAspect="1"/>
             </wp:cNvGraphicFramePr>
@@ -3674,7 +3935,7 @@
               <a:graphicData uri="http://schemas.openxmlformats.org/drawingml/2006/picture">
                 <pic:pic xmlns:pic="http://schemas.openxmlformats.org/drawingml/2006/picture">
                   <pic:nvPicPr>
-                    <pic:cNvPr id="1425045899" name="Picture 2" descr="A screenshot of a computer program&#10;&#10;AI-generated content may be incorrect."/>
+                    <pic:cNvPr id="1425045899" name="Picture 2"/>
                     <pic:cNvPicPr/>
                   </pic:nvPicPr>
                   <pic:blipFill>
@@ -3692,7 +3953,7 @@
                   <pic:spPr>
                     <a:xfrm>
                       <a:off x="0" y="0"/>
-                      <a:ext cx="5414077" cy="3140282"/>
+                      <a:ext cx="6251587" cy="3896822"/>
                     </a:xfrm>
                     <a:prstGeom prst="rect">
                       <a:avLst/>
@@ -3707,15 +3968,26 @@
     </w:p>
     <w:p>
       <w:pPr>
-        <w:pStyle w:val="BodyText"/>
-        <w:rPr>
-          <w:lang w:val="hr-HR"/>
-        </w:rPr>
-      </w:pPr>
+        <w:widowControl/>
+        <w:spacing w:line="240" w:lineRule="auto"/>
+        <w:rPr>
+          <w:lang w:val="hr-HR"/>
+        </w:rPr>
+      </w:pPr>
+      <w:r>
+        <w:rPr>
+          <w:lang w:val="hr-HR"/>
+        </w:rPr>
+        <w:br w:type="page"/>
+      </w:r>
     </w:p>
     <w:p>
       <w:pPr>
         <w:pStyle w:val="Heading1"/>
+        <w:numPr>
+          <w:ilvl w:val="0"/>
+          <w:numId w:val="5"/>
+        </w:numPr>
         <w:rPr>
           <w:lang w:val="hr-HR"/>
         </w:rPr>
@@ -3725,6 +3997,7 @@
         <w:rPr>
           <w:lang w:val="hr-HR"/>
         </w:rPr>
+        <w:lastRenderedPageBreak/>
         <w:t>Zapisnici sastanaka</w:t>
       </w:r>
       <w:bookmarkEnd w:id="17"/>
@@ -3732,35 +4005,29 @@
     <w:p>
       <w:pPr>
         <w:pStyle w:val="InfoBlue"/>
-        <w:rPr>
-          <w:lang w:val="hr-HR"/>
-        </w:rPr>
-      </w:pPr>
-      <w:r>
-        <w:rPr>
-          <w:lang w:val="hr-HR"/>
-        </w:rPr>
+      </w:pPr>
+      <w:r>
         <w:t>[Ovdje za svaki održani sastanak navesti: datum, vrijeme i mjesto održavanja sastanaka, popis nazočnih, glavne zaključke sastanka.]</w:t>
       </w:r>
     </w:p>
     <w:tbl>
       <w:tblPr>
         <w:tblStyle w:val="TableGrid"/>
-        <w:tblW w:w="8630" w:type="dxa"/>
-        <w:tblInd w:w="720" w:type="dxa"/>
+        <w:tblW w:w="9242" w:type="dxa"/>
+        <w:tblInd w:w="108" w:type="dxa"/>
         <w:tblLayout w:type="fixed"/>
         <w:tblLook w:val="04A0" w:firstRow="1" w:lastRow="0" w:firstColumn="1" w:lastColumn="0" w:noHBand="0" w:noVBand="1"/>
       </w:tblPr>
       <w:tblGrid>
-        <w:gridCol w:w="2117"/>
-        <w:gridCol w:w="2192"/>
-        <w:gridCol w:w="2154"/>
-        <w:gridCol w:w="2167"/>
+        <w:gridCol w:w="1560"/>
+        <w:gridCol w:w="1559"/>
+        <w:gridCol w:w="3402"/>
+        <w:gridCol w:w="2721"/>
       </w:tblGrid>
       <w:tr>
         <w:tc>
           <w:tcPr>
-            <w:tcW w:w="2116" w:type="dxa"/>
+            <w:tcW w:w="1560" w:type="dxa"/>
           </w:tcPr>
           <w:p>
             <w:pPr>
@@ -3782,7 +4049,7 @@
         </w:tc>
         <w:tc>
           <w:tcPr>
-            <w:tcW w:w="2192" w:type="dxa"/>
+            <w:tcW w:w="1559" w:type="dxa"/>
           </w:tcPr>
           <w:p>
             <w:pPr>
@@ -3804,7 +4071,7 @@
         </w:tc>
         <w:tc>
           <w:tcPr>
-            <w:tcW w:w="2154" w:type="dxa"/>
+            <w:tcW w:w="3402" w:type="dxa"/>
           </w:tcPr>
           <w:p>
             <w:pPr>
@@ -3826,7 +4093,7 @@
         </w:tc>
         <w:tc>
           <w:tcPr>
-            <w:tcW w:w="2167" w:type="dxa"/>
+            <w:tcW w:w="2721" w:type="dxa"/>
           </w:tcPr>
           <w:p>
             <w:pPr>
@@ -3850,7 +4117,7 @@
       <w:tr>
         <w:tc>
           <w:tcPr>
-            <w:tcW w:w="2116" w:type="dxa"/>
+            <w:tcW w:w="1560" w:type="dxa"/>
           </w:tcPr>
           <w:p>
             <w:pPr>
@@ -3865,13 +4132,25 @@
               <w:rPr>
                 <w:lang w:val="hr-HR"/>
               </w:rPr>
-              <w:t>7. listopad 2025. 16.15</w:t>
-            </w:r>
-          </w:p>
-        </w:tc>
-        <w:tc>
-          <w:tcPr>
-            <w:tcW w:w="2192" w:type="dxa"/>
+              <w:t xml:space="preserve">7. listopad 2025. </w:t>
+            </w:r>
+            <w:r>
+              <w:rPr>
+                <w:lang w:val="hr-HR"/>
+              </w:rPr>
+              <w:br/>
+            </w:r>
+            <w:r>
+              <w:rPr>
+                <w:lang w:val="hr-HR"/>
+              </w:rPr>
+              <w:t>16.15</w:t>
+            </w:r>
+          </w:p>
+        </w:tc>
+        <w:tc>
+          <w:tcPr>
+            <w:tcW w:w="1559" w:type="dxa"/>
           </w:tcPr>
           <w:p>
             <w:pPr>
@@ -3892,7 +4171,7 @@
         </w:tc>
         <w:tc>
           <w:tcPr>
-            <w:tcW w:w="2154" w:type="dxa"/>
+            <w:tcW w:w="3402" w:type="dxa"/>
           </w:tcPr>
           <w:p>
             <w:pPr>
@@ -3907,13 +4186,98 @@
               <w:rPr>
                 <w:lang w:val="hr-HR"/>
               </w:rPr>
-              <w:t>Jakov Ramljak, Martin Golub, Leon Katić, Stjepan Džidžić, Matea Maračić, Željka Mihajlović</w:t>
-            </w:r>
-          </w:p>
-        </w:tc>
-        <w:tc>
-          <w:tcPr>
-            <w:tcW w:w="2167" w:type="dxa"/>
+              <w:t>Željka Mihajlović</w:t>
+            </w:r>
+            <w:r>
+              <w:rPr>
+                <w:bCs/>
+                <w:lang w:val="hr-HR"/>
+              </w:rPr>
+              <w:t xml:space="preserve"> (mentorica)</w:t>
+            </w:r>
+            <w:r>
+              <w:rPr>
+                <w:lang w:val="hr-HR"/>
+              </w:rPr>
+              <w:t>,</w:t>
+            </w:r>
+            <w:r>
+              <w:rPr>
+                <w:lang w:val="hr-HR"/>
+              </w:rPr>
+              <w:br/>
+            </w:r>
+            <w:r>
+              <w:rPr>
+                <w:lang w:val="hr-HR"/>
+              </w:rPr>
+              <w:t>Jakov Ramljak</w:t>
+            </w:r>
+            <w:r>
+              <w:rPr>
+                <w:lang w:val="hr-HR"/>
+              </w:rPr>
+              <w:t xml:space="preserve"> (voditelj)</w:t>
+            </w:r>
+            <w:r>
+              <w:rPr>
+                <w:lang w:val="hr-HR"/>
+              </w:rPr>
+              <w:t xml:space="preserve">, </w:t>
+            </w:r>
+            <w:r>
+              <w:rPr>
+                <w:lang w:val="hr-HR"/>
+              </w:rPr>
+              <w:br/>
+            </w:r>
+            <w:r>
+              <w:rPr>
+                <w:lang w:val="hr-HR"/>
+              </w:rPr>
+              <w:t xml:space="preserve">Martin Golub, </w:t>
+            </w:r>
+            <w:r>
+              <w:rPr>
+                <w:lang w:val="hr-HR"/>
+              </w:rPr>
+              <w:br/>
+            </w:r>
+            <w:r>
+              <w:rPr>
+                <w:lang w:val="hr-HR"/>
+              </w:rPr>
+              <w:t xml:space="preserve">Leon Katić, </w:t>
+            </w:r>
+            <w:r>
+              <w:rPr>
+                <w:lang w:val="hr-HR"/>
+              </w:rPr>
+              <w:br/>
+            </w:r>
+            <w:r>
+              <w:rPr>
+                <w:lang w:val="hr-HR"/>
+              </w:rPr>
+              <w:t xml:space="preserve">Stjepan Džidžić, </w:t>
+            </w:r>
+            <w:r>
+              <w:rPr>
+                <w:lang w:val="hr-HR"/>
+              </w:rPr>
+              <w:br/>
+            </w:r>
+            <w:r>
+              <w:rPr>
+                <w:lang w:val="hr-HR"/>
+              </w:rPr>
+              <w:t>Matea Maračić</w:t>
+            </w:r>
+          </w:p>
+        </w:tc>
+        <w:tc>
+          <w:tcPr>
+            <w:tcW w:w="2721" w:type="dxa"/>
           </w:tcPr>
           <w:p>
             <w:pPr>
@@ -3928,7 +4292,13 @@
               <w:rPr>
                 <w:lang w:val="hr-HR"/>
               </w:rPr>
-              <w:t>Prvi sastanak, općenite informacije o projektu, potencijalne teme -&gt; simulacija drona</w:t>
+              <w:t>Prvi sastanak, općenite informacije o projektu, potencijalne teme</w:t>
+            </w:r>
+            <w:r>
+              <w:rPr>
+                <w:lang w:val="hr-HR"/>
+              </w:rPr>
+              <w:t>.</w:t>
             </w:r>
           </w:p>
         </w:tc>
@@ -3936,7 +4306,7 @@
       <w:tr>
         <w:tc>
           <w:tcPr>
-            <w:tcW w:w="2116" w:type="dxa"/>
+            <w:tcW w:w="1560" w:type="dxa"/>
             <w:tcBorders>
               <w:top w:val="nil"/>
             </w:tcBorders>
@@ -3956,15 +4326,12 @@
               </w:rPr>
               <w:t>10. listopad 2025.</w:t>
             </w:r>
-          </w:p>
-          <w:p>
-            <w:pPr>
-              <w:pStyle w:val="BodyText"/>
-              <w:ind w:left="0"/>
-              <w:rPr>
-                <w:lang w:val="hr-HR"/>
-              </w:rPr>
-            </w:pPr>
+            <w:r>
+              <w:rPr>
+                <w:lang w:val="hr-HR"/>
+              </w:rPr>
+              <w:br/>
+            </w:r>
             <w:r>
               <w:rPr>
                 <w:lang w:val="hr-HR"/>
@@ -3975,7 +4342,7 @@
         </w:tc>
         <w:tc>
           <w:tcPr>
-            <w:tcW w:w="2192" w:type="dxa"/>
+            <w:tcW w:w="1559" w:type="dxa"/>
             <w:tcBorders>
               <w:top w:val="nil"/>
             </w:tcBorders>
@@ -3999,7 +4366,7 @@
         </w:tc>
         <w:tc>
           <w:tcPr>
-            <w:tcW w:w="2154" w:type="dxa"/>
+            <w:tcW w:w="3402" w:type="dxa"/>
             <w:tcBorders>
               <w:top w:val="nil"/>
             </w:tcBorders>
@@ -4017,13 +4384,61 @@
               <w:rPr>
                 <w:lang w:val="hr-HR"/>
               </w:rPr>
-              <w:t>Jakov Ramljak, Martin Golub, Leon Katić, Stjepan Džidžić</w:t>
-            </w:r>
-          </w:p>
-        </w:tc>
-        <w:tc>
-          <w:tcPr>
-            <w:tcW w:w="2167" w:type="dxa"/>
+              <w:t>Jakov Ramljak</w:t>
+            </w:r>
+            <w:r>
+              <w:rPr>
+                <w:lang w:val="hr-HR"/>
+              </w:rPr>
+              <w:t xml:space="preserve"> (voditelj)</w:t>
+            </w:r>
+            <w:r>
+              <w:rPr>
+                <w:lang w:val="hr-HR"/>
+              </w:rPr>
+              <w:t xml:space="preserve">, </w:t>
+            </w:r>
+            <w:r>
+              <w:rPr>
+                <w:lang w:val="hr-HR"/>
+              </w:rPr>
+              <w:br/>
+            </w:r>
+            <w:r>
+              <w:rPr>
+                <w:lang w:val="hr-HR"/>
+              </w:rPr>
+              <w:t xml:space="preserve">Martin Golub, </w:t>
+            </w:r>
+            <w:r>
+              <w:rPr>
+                <w:lang w:val="hr-HR"/>
+              </w:rPr>
+              <w:br/>
+            </w:r>
+            <w:r>
+              <w:rPr>
+                <w:lang w:val="hr-HR"/>
+              </w:rPr>
+              <w:t xml:space="preserve">Leon Katić, </w:t>
+            </w:r>
+            <w:r>
+              <w:rPr>
+                <w:lang w:val="hr-HR"/>
+              </w:rPr>
+              <w:br/>
+            </w:r>
+            <w:r>
+              <w:rPr>
+                <w:lang w:val="hr-HR"/>
+              </w:rPr>
+              <w:t>Stjepan Džidžić</w:t>
+            </w:r>
+          </w:p>
+        </w:tc>
+        <w:tc>
+          <w:tcPr>
+            <w:tcW w:w="2721" w:type="dxa"/>
             <w:tcBorders>
               <w:top w:val="nil"/>
             </w:tcBorders>
@@ -4043,13 +4458,19 @@
               </w:rPr>
               <w:t>Rasprava o odabiru teme</w:t>
             </w:r>
+            <w:r>
+              <w:rPr>
+                <w:lang w:val="hr-HR"/>
+              </w:rPr>
+              <w:t>.</w:t>
+            </w:r>
           </w:p>
         </w:tc>
       </w:tr>
       <w:tr>
         <w:tc>
           <w:tcPr>
-            <w:tcW w:w="2116" w:type="dxa"/>
+            <w:tcW w:w="1560" w:type="dxa"/>
             <w:tcBorders>
               <w:top w:val="nil"/>
             </w:tcBorders>
@@ -4067,17 +4488,26 @@
               <w:rPr>
                 <w:lang w:val="hr-HR"/>
               </w:rPr>
-              <w:t>10. listopad 2025.</w:t>
-            </w:r>
-          </w:p>
-          <w:p>
-            <w:pPr>
-              <w:pStyle w:val="BodyText"/>
-              <w:ind w:left="0"/>
-              <w:rPr>
-                <w:lang w:val="hr-HR"/>
-              </w:rPr>
-            </w:pPr>
+              <w:t>1</w:t>
+            </w:r>
+            <w:r>
+              <w:rPr>
+                <w:lang w:val="hr-HR"/>
+              </w:rPr>
+              <w:t>4</w:t>
+            </w:r>
+            <w:r>
+              <w:rPr>
+                <w:lang w:val="hr-HR"/>
+              </w:rPr>
+              <w:t>. listopad 2025.</w:t>
+            </w:r>
+            <w:r>
+              <w:rPr>
+                <w:lang w:val="hr-HR"/>
+              </w:rPr>
+              <w:br/>
+            </w:r>
             <w:r>
               <w:rPr>
                 <w:lang w:val="hr-HR"/>
@@ -4088,7 +4518,7 @@
         </w:tc>
         <w:tc>
           <w:tcPr>
-            <w:tcW w:w="2192" w:type="dxa"/>
+            <w:tcW w:w="1559" w:type="dxa"/>
             <w:tcBorders>
               <w:top w:val="nil"/>
             </w:tcBorders>
@@ -4112,7 +4542,7 @@
         </w:tc>
         <w:tc>
           <w:tcPr>
-            <w:tcW w:w="2154" w:type="dxa"/>
+            <w:tcW w:w="3402" w:type="dxa"/>
             <w:tcBorders>
               <w:top w:val="nil"/>
             </w:tcBorders>
@@ -4130,13 +4560,73 @@
               <w:rPr>
                 <w:lang w:val="hr-HR"/>
               </w:rPr>
-              <w:t>Jakov Ramljak, Martin Golub, Leon Katić, Stjepan Džidžić, Matea Maračić,</w:t>
-            </w:r>
-          </w:p>
-        </w:tc>
-        <w:tc>
-          <w:tcPr>
-            <w:tcW w:w="2167" w:type="dxa"/>
+              <w:t>Jakov Ramljak</w:t>
+            </w:r>
+            <w:r>
+              <w:rPr>
+                <w:lang w:val="hr-HR"/>
+              </w:rPr>
+              <w:t xml:space="preserve"> (voditelj)</w:t>
+            </w:r>
+            <w:r>
+              <w:rPr>
+                <w:lang w:val="hr-HR"/>
+              </w:rPr>
+              <w:t xml:space="preserve">, </w:t>
+            </w:r>
+            <w:r>
+              <w:rPr>
+                <w:lang w:val="hr-HR"/>
+              </w:rPr>
+              <w:br/>
+            </w:r>
+            <w:r>
+              <w:rPr>
+                <w:lang w:val="hr-HR"/>
+              </w:rPr>
+              <w:t xml:space="preserve">Martin Golub, </w:t>
+            </w:r>
+            <w:r>
+              <w:rPr>
+                <w:lang w:val="hr-HR"/>
+              </w:rPr>
+              <w:br/>
+            </w:r>
+            <w:r>
+              <w:rPr>
+                <w:lang w:val="hr-HR"/>
+              </w:rPr>
+              <w:t xml:space="preserve">Leon Katić, </w:t>
+            </w:r>
+            <w:r>
+              <w:rPr>
+                <w:lang w:val="hr-HR"/>
+              </w:rPr>
+              <w:br/>
+            </w:r>
+            <w:r>
+              <w:rPr>
+                <w:lang w:val="hr-HR"/>
+              </w:rPr>
+              <w:t xml:space="preserve">Stjepan Džidžić, </w:t>
+            </w:r>
+            <w:r>
+              <w:rPr>
+                <w:lang w:val="hr-HR"/>
+              </w:rPr>
+              <w:br/>
+            </w:r>
+            <w:r>
+              <w:rPr>
+                <w:lang w:val="hr-HR"/>
+              </w:rPr>
+              <w:t>Matea Maračić</w:t>
+            </w:r>
+          </w:p>
+        </w:tc>
+        <w:tc>
+          <w:tcPr>
+            <w:tcW w:w="2721" w:type="dxa"/>
             <w:tcBorders>
               <w:top w:val="nil"/>
             </w:tcBorders>
@@ -4156,13 +4646,19 @@
               </w:rPr>
               <w:t>Rasprava o odabiru teme</w:t>
             </w:r>
+            <w:r>
+              <w:rPr>
+                <w:lang w:val="hr-HR"/>
+              </w:rPr>
+              <w:t>.</w:t>
+            </w:r>
           </w:p>
         </w:tc>
       </w:tr>
       <w:tr>
         <w:tc>
           <w:tcPr>
-            <w:tcW w:w="2116" w:type="dxa"/>
+            <w:tcW w:w="1560" w:type="dxa"/>
           </w:tcPr>
           <w:p>
             <w:pPr>
@@ -4187,14 +4683,13 @@
                 <w:sz w:val="20"/>
                 <w:lang w:val="hr-HR"/>
               </w:rPr>
-              <w:lastRenderedPageBreak/>
               <w:t>14. listopad 2025. 16.00</w:t>
             </w:r>
           </w:p>
         </w:tc>
         <w:tc>
           <w:tcPr>
-            <w:tcW w:w="2192" w:type="dxa"/>
+            <w:tcW w:w="1559" w:type="dxa"/>
           </w:tcPr>
           <w:p>
             <w:pPr>
@@ -4216,7 +4711,7 @@
         </w:tc>
         <w:tc>
           <w:tcPr>
-            <w:tcW w:w="2154" w:type="dxa"/>
+            <w:tcW w:w="3402" w:type="dxa"/>
           </w:tcPr>
           <w:p>
             <w:pPr>
@@ -4224,21 +4719,117 @@
               <w:keepLines w:val="0"/>
               <w:ind w:left="0"/>
               <w:rPr>
+                <w:lang w:val="hr-HR"/>
+              </w:rPr>
+            </w:pPr>
+            <w:r>
+              <w:rPr>
+                <w:lang w:val="hr-HR"/>
+              </w:rPr>
+              <w:t>Željka Mihajlović</w:t>
+            </w:r>
+            <w:r>
+              <w:rPr>
                 <w:bCs/>
                 <w:lang w:val="hr-HR"/>
               </w:rPr>
-            </w:pPr>
-            <w:r>
-              <w:rPr>
-                <w:lang w:val="hr-HR"/>
-              </w:rPr>
-              <w:t>Jakov Ramljak, Martin Golub, Leon Katić, Stjepan Džidžić, Matea Maračić, Željka Mihajlović</w:t>
-            </w:r>
-          </w:p>
-        </w:tc>
-        <w:tc>
-          <w:tcPr>
-            <w:tcW w:w="2167" w:type="dxa"/>
+              <w:t xml:space="preserve"> (mentorica)</w:t>
+            </w:r>
+            <w:r>
+              <w:rPr>
+                <w:lang w:val="hr-HR"/>
+              </w:rPr>
+              <w:t>,</w:t>
+            </w:r>
+            <w:r>
+              <w:rPr>
+                <w:lang w:val="hr-HR"/>
+              </w:rPr>
+              <w:br/>
+            </w:r>
+            <w:r>
+              <w:rPr>
+                <w:lang w:val="hr-HR"/>
+              </w:rPr>
+              <w:t>Jakov Ramljak</w:t>
+            </w:r>
+            <w:r>
+              <w:rPr>
+                <w:lang w:val="hr-HR"/>
+              </w:rPr>
+              <w:t xml:space="preserve"> (voditelj)</w:t>
+            </w:r>
+            <w:r>
+              <w:rPr>
+                <w:lang w:val="hr-HR"/>
+              </w:rPr>
+              <w:t xml:space="preserve">, </w:t>
+            </w:r>
+            <w:r>
+              <w:rPr>
+                <w:lang w:val="hr-HR"/>
+              </w:rPr>
+              <w:br/>
+            </w:r>
+            <w:r>
+              <w:rPr>
+                <w:lang w:val="hr-HR"/>
+              </w:rPr>
+              <w:t>Martin Golub,</w:t>
+            </w:r>
+            <w:r>
+              <w:rPr>
+                <w:lang w:val="hr-HR"/>
+              </w:rPr>
+              <w:t xml:space="preserve"> </w:t>
+            </w:r>
+            <w:r>
+              <w:rPr>
+                <w:lang w:val="hr-HR"/>
+              </w:rPr>
+              <w:br/>
+            </w:r>
+            <w:r>
+              <w:rPr>
+                <w:lang w:val="hr-HR"/>
+              </w:rPr>
+              <w:t xml:space="preserve">Leon Katić, </w:t>
+            </w:r>
+            <w:r>
+              <w:rPr>
+                <w:lang w:val="hr-HR"/>
+              </w:rPr>
+              <w:br/>
+            </w:r>
+            <w:r>
+              <w:rPr>
+                <w:lang w:val="hr-HR"/>
+              </w:rPr>
+              <w:t>Stjepan Džidžić,</w:t>
+            </w:r>
+            <w:r>
+              <w:rPr>
+                <w:lang w:val="hr-HR"/>
+              </w:rPr>
+              <w:t xml:space="preserve"> </w:t>
+            </w:r>
+            <w:r>
+              <w:rPr>
+                <w:lang w:val="hr-HR"/>
+              </w:rPr>
+              <w:br/>
+            </w:r>
+            <w:r>
+              <w:rPr>
+                <w:lang w:val="hr-HR"/>
+              </w:rPr>
+              <w:t xml:space="preserve">Matea Maračić, </w:t>
+            </w:r>
+          </w:p>
+        </w:tc>
+        <w:tc>
+          <w:tcPr>
+            <w:tcW w:w="2721" w:type="dxa"/>
           </w:tcPr>
           <w:p>
             <w:pPr>
@@ -4255,7 +4846,42 @@
                 <w:bCs/>
                 <w:lang w:val="hr-HR"/>
               </w:rPr>
-              <w:t>Potvrda izabrane teme simulacija dostavljanja paketa dronom, Jakov Ramljak izabran kao voditelj tima, podjela poslova među timom: Jakov kao voditelj i glavni za Godot, Stjepan i Leon za fiziku u Godotu, Martin i Matea za dizajn i modeliranje</w:t>
+              <w:t>Potvrda izabrane teme</w:t>
+            </w:r>
+            <w:r>
+              <w:rPr>
+                <w:bCs/>
+                <w:lang w:val="hr-HR"/>
+              </w:rPr>
+              <w:t xml:space="preserve">, izabran </w:t>
+            </w:r>
+            <w:r>
+              <w:rPr>
+                <w:bCs/>
+                <w:lang w:val="hr-HR"/>
+              </w:rPr>
+              <w:t>voditelj tima</w:t>
+            </w:r>
+            <w:r>
+              <w:rPr>
+                <w:bCs/>
+                <w:lang w:val="hr-HR"/>
+              </w:rPr>
+              <w:t>, p</w:t>
+            </w:r>
+            <w:r>
+              <w:rPr>
+                <w:bCs/>
+                <w:lang w:val="hr-HR"/>
+              </w:rPr>
+              <w:t>odjela poslova među timom</w:t>
+            </w:r>
+            <w:r>
+              <w:rPr>
+                <w:bCs/>
+                <w:lang w:val="hr-HR"/>
+              </w:rPr>
+              <w:t>.</w:t>
             </w:r>
           </w:p>
         </w:tc>
@@ -4263,7 +4889,7 @@
       <w:tr>
         <w:tc>
           <w:tcPr>
-            <w:tcW w:w="2116" w:type="dxa"/>
+            <w:tcW w:w="1560" w:type="dxa"/>
           </w:tcPr>
           <w:p>
             <w:pPr>
@@ -4282,16 +4908,13 @@
               </w:rPr>
               <w:t>31. listopad 2025.</w:t>
             </w:r>
-          </w:p>
-          <w:p>
-            <w:pPr>
-              <w:pStyle w:val="BodyText"/>
-              <w:ind w:left="0"/>
+            <w:r>
               <w:rPr>
                 <w:bCs/>
                 <w:lang w:val="hr-HR"/>
               </w:rPr>
-            </w:pPr>
+              <w:br/>
+            </w:r>
             <w:r>
               <w:rPr>
                 <w:bCs/>
@@ -4303,7 +4926,7 @@
         </w:tc>
         <w:tc>
           <w:tcPr>
-            <w:tcW w:w="2192" w:type="dxa"/>
+            <w:tcW w:w="1559" w:type="dxa"/>
           </w:tcPr>
           <w:p>
             <w:pPr>
@@ -4325,7 +4948,7 @@
         </w:tc>
         <w:tc>
           <w:tcPr>
-            <w:tcW w:w="2154" w:type="dxa"/>
+            <w:tcW w:w="3402" w:type="dxa"/>
           </w:tcPr>
           <w:p>
             <w:pPr>
@@ -4341,13 +4964,73 @@
               <w:rPr>
                 <w:lang w:val="hr-HR"/>
               </w:rPr>
-              <w:t>Jakov Ramljak, Martin Golub, Leon Katić, Stjepan Džidžić, Matea Maračić</w:t>
-            </w:r>
-          </w:p>
-        </w:tc>
-        <w:tc>
-          <w:tcPr>
-            <w:tcW w:w="2167" w:type="dxa"/>
+              <w:t>Jakov Ramljak</w:t>
+            </w:r>
+            <w:r>
+              <w:rPr>
+                <w:lang w:val="hr-HR"/>
+              </w:rPr>
+              <w:t xml:space="preserve"> (voditelj)</w:t>
+            </w:r>
+            <w:r>
+              <w:rPr>
+                <w:lang w:val="hr-HR"/>
+              </w:rPr>
+              <w:t xml:space="preserve">, </w:t>
+            </w:r>
+            <w:r>
+              <w:rPr>
+                <w:lang w:val="hr-HR"/>
+              </w:rPr>
+              <w:br/>
+            </w:r>
+            <w:r>
+              <w:rPr>
+                <w:lang w:val="hr-HR"/>
+              </w:rPr>
+              <w:t xml:space="preserve">Martin Golub, </w:t>
+            </w:r>
+            <w:r>
+              <w:rPr>
+                <w:lang w:val="hr-HR"/>
+              </w:rPr>
+              <w:br/>
+            </w:r>
+            <w:r>
+              <w:rPr>
+                <w:lang w:val="hr-HR"/>
+              </w:rPr>
+              <w:t xml:space="preserve">Leon Katić, </w:t>
+            </w:r>
+            <w:r>
+              <w:rPr>
+                <w:lang w:val="hr-HR"/>
+              </w:rPr>
+              <w:br/>
+            </w:r>
+            <w:r>
+              <w:rPr>
+                <w:lang w:val="hr-HR"/>
+              </w:rPr>
+              <w:t xml:space="preserve">Stjepan Džidžić, </w:t>
+            </w:r>
+            <w:r>
+              <w:rPr>
+                <w:lang w:val="hr-HR"/>
+              </w:rPr>
+              <w:br/>
+            </w:r>
+            <w:r>
+              <w:rPr>
+                <w:lang w:val="hr-HR"/>
+              </w:rPr>
+              <w:t>Matea Maračić</w:t>
+            </w:r>
+          </w:p>
+        </w:tc>
+        <w:tc>
+          <w:tcPr>
+            <w:tcW w:w="2721" w:type="dxa"/>
           </w:tcPr>
           <w:p>
             <w:pPr>
@@ -4372,7 +5055,7 @@
       <w:tr>
         <w:tc>
           <w:tcPr>
-            <w:tcW w:w="2116" w:type="dxa"/>
+            <w:tcW w:w="1560" w:type="dxa"/>
           </w:tcPr>
           <w:p>
             <w:pPr>
@@ -4384,11 +5067,47 @@
                 <w:lang w:val="hr-HR"/>
               </w:rPr>
             </w:pPr>
-          </w:p>
-        </w:tc>
-        <w:tc>
-          <w:tcPr>
-            <w:tcW w:w="2192" w:type="dxa"/>
+            <w:r>
+              <w:rPr>
+                <w:bCs/>
+                <w:lang w:val="hr-HR"/>
+              </w:rPr>
+              <w:t>7.</w:t>
+            </w:r>
+            <w:r>
+              <w:rPr>
+                <w:bCs/>
+                <w:lang w:val="hr-HR"/>
+              </w:rPr>
+              <w:t xml:space="preserve"> </w:t>
+            </w:r>
+            <w:r>
+              <w:rPr>
+                <w:bCs/>
+                <w:lang w:val="hr-HR"/>
+              </w:rPr>
+              <w:t>studeni</w:t>
+            </w:r>
+            <w:r>
+              <w:rPr>
+                <w:bCs/>
+                <w:lang w:val="hr-HR"/>
+              </w:rPr>
+              <w:t xml:space="preserve"> 2025.</w:t>
+            </w:r>
+            <w:r>
+              <w:rPr>
+                <w:bCs/>
+                <w:lang w:val="hr-HR"/>
+              </w:rPr>
+              <w:br/>
+              <w:t>11:30</w:t>
+            </w:r>
+          </w:p>
+        </w:tc>
+        <w:tc>
+          <w:tcPr>
+            <w:tcW w:w="1559" w:type="dxa"/>
           </w:tcPr>
           <w:p>
             <w:pPr>
@@ -4400,11 +5119,18 @@
                 <w:lang w:val="hr-HR"/>
               </w:rPr>
             </w:pPr>
-          </w:p>
-        </w:tc>
-        <w:tc>
-          <w:tcPr>
-            <w:tcW w:w="2154" w:type="dxa"/>
+            <w:r>
+              <w:rPr>
+                <w:bCs/>
+                <w:lang w:val="hr-HR"/>
+              </w:rPr>
+              <w:t>Fakultet elektrotehnike i računarstva</w:t>
+            </w:r>
+          </w:p>
+        </w:tc>
+        <w:tc>
+          <w:tcPr>
+            <w:tcW w:w="3402" w:type="dxa"/>
           </w:tcPr>
           <w:p>
             <w:pPr>
@@ -4416,11 +5142,100 @@
                 <w:lang w:val="hr-HR"/>
               </w:rPr>
             </w:pPr>
-          </w:p>
-        </w:tc>
-        <w:tc>
-          <w:tcPr>
-            <w:tcW w:w="2167" w:type="dxa"/>
+            <w:r>
+              <w:rPr>
+                <w:bCs/>
+                <w:lang w:val="hr-HR"/>
+              </w:rPr>
+              <w:t>Željka Mihajlović</w:t>
+            </w:r>
+            <w:r>
+              <w:rPr>
+                <w:bCs/>
+                <w:lang w:val="hr-HR"/>
+              </w:rPr>
+              <w:t xml:space="preserve"> (mentorica),</w:t>
+            </w:r>
+            <w:r>
+              <w:rPr>
+                <w:bCs/>
+                <w:lang w:val="hr-HR"/>
+              </w:rPr>
+              <w:br/>
+            </w:r>
+            <w:r>
+              <w:rPr>
+                <w:bCs/>
+                <w:lang w:val="hr-HR"/>
+              </w:rPr>
+              <w:t>Jakov Ramljak</w:t>
+            </w:r>
+            <w:r>
+              <w:rPr>
+                <w:lang w:val="hr-HR"/>
+              </w:rPr>
+              <w:t xml:space="preserve"> (voditelj)</w:t>
+            </w:r>
+            <w:r>
+              <w:rPr>
+                <w:bCs/>
+                <w:lang w:val="hr-HR"/>
+              </w:rPr>
+              <w:t xml:space="preserve">, </w:t>
+            </w:r>
+            <w:r>
+              <w:rPr>
+                <w:bCs/>
+                <w:lang w:val="hr-HR"/>
+              </w:rPr>
+              <w:br/>
+            </w:r>
+            <w:r>
+              <w:rPr>
+                <w:bCs/>
+                <w:lang w:val="hr-HR"/>
+              </w:rPr>
+              <w:t xml:space="preserve">Martin Golub, </w:t>
+            </w:r>
+            <w:r>
+              <w:rPr>
+                <w:bCs/>
+                <w:lang w:val="hr-HR"/>
+              </w:rPr>
+              <w:br/>
+            </w:r>
+            <w:r>
+              <w:rPr>
+                <w:bCs/>
+                <w:lang w:val="hr-HR"/>
+              </w:rPr>
+              <w:t xml:space="preserve">Leon Katić, </w:t>
+            </w:r>
+            <w:r>
+              <w:rPr>
+                <w:bCs/>
+                <w:lang w:val="hr-HR"/>
+              </w:rPr>
+              <w:br/>
+            </w:r>
+            <w:r>
+              <w:rPr>
+                <w:bCs/>
+                <w:lang w:val="hr-HR"/>
+              </w:rPr>
+              <w:t xml:space="preserve">Stjepan </w:t>
+            </w:r>
+            <w:r>
+              <w:rPr>
+                <w:lang w:val="hr-HR"/>
+              </w:rPr>
+              <w:t>Džidžić</w:t>
+            </w:r>
+          </w:p>
+        </w:tc>
+        <w:tc>
+          <w:tcPr>
+            <w:tcW w:w="2721" w:type="dxa"/>
           </w:tcPr>
           <w:p>
             <w:pPr>
@@ -4432,13 +5247,20 @@
                 <w:lang w:val="hr-HR"/>
               </w:rPr>
             </w:pPr>
+            <w:r>
+              <w:rPr>
+                <w:bCs/>
+                <w:lang w:val="hr-HR"/>
+              </w:rPr>
+              <w:t>Demonstriranje napretka u projektu. Informacije o formuliranju dokumenta plana projekta.</w:t>
+            </w:r>
           </w:p>
         </w:tc>
       </w:tr>
       <w:tr>
         <w:tc>
           <w:tcPr>
-            <w:tcW w:w="2116" w:type="dxa"/>
+            <w:tcW w:w="1560" w:type="dxa"/>
           </w:tcPr>
           <w:p>
             <w:pPr>
@@ -4454,7 +5276,7 @@
         </w:tc>
         <w:tc>
           <w:tcPr>
-            <w:tcW w:w="2192" w:type="dxa"/>
+            <w:tcW w:w="1559" w:type="dxa"/>
           </w:tcPr>
           <w:p>
             <w:pPr>
@@ -4470,7 +5292,7 @@
         </w:tc>
         <w:tc>
           <w:tcPr>
-            <w:tcW w:w="2154" w:type="dxa"/>
+            <w:tcW w:w="3402" w:type="dxa"/>
           </w:tcPr>
           <w:p>
             <w:pPr>
@@ -4486,7 +5308,7 @@
         </w:tc>
         <w:tc>
           <w:tcPr>
-            <w:tcW w:w="2167" w:type="dxa"/>
+            <w:tcW w:w="2721" w:type="dxa"/>
           </w:tcPr>
           <w:p>
             <w:pPr>
@@ -4506,24 +5328,7 @@
       <w:pPr>
         <w:pStyle w:val="BodyText"/>
         <w:keepLines w:val="0"/>
-        <w:rPr>
-          <w:lang w:val="hr-HR"/>
-        </w:rPr>
-      </w:pPr>
-    </w:p>
-    <w:p>
-      <w:pPr>
-        <w:pStyle w:val="BodyText"/>
-        <w:keepLines w:val="0"/>
-        <w:rPr>
-          <w:lang w:val="hr-HR"/>
-        </w:rPr>
-      </w:pPr>
-    </w:p>
-    <w:p>
-      <w:pPr>
-        <w:pStyle w:val="BodyText"/>
-        <w:keepLines w:val="0"/>
+        <w:ind w:left="0"/>
         <w:rPr>
           <w:lang w:val="hr-HR"/>
         </w:rPr>
@@ -6059,6 +6864,95 @@
 <file path=word/numbering.xml><?xml version="1.0" encoding="utf-8"?>
 <w:numbering xmlns:wpc="http://schemas.microsoft.com/office/word/2010/wordprocessingCanvas" xmlns:cx="http://schemas.microsoft.com/office/drawing/2014/chartex" xmlns:cx1="http://schemas.microsoft.com/office/drawing/2015/9/8/chartex" xmlns:cx2="http://schemas.microsoft.com/office/drawing/2015/10/21/chartex" xmlns:cx3="http://schemas.microsoft.com/office/drawing/2016/5/9/chartex" xmlns:cx4="http://schemas.microsoft.com/office/drawing/2016/5/10/chartex" xmlns:cx5="http://schemas.microsoft.com/office/drawing/2016/5/11/chartex" xmlns:cx6="http://schemas.microsoft.com/office/drawing/2016/5/12/chartex" xmlns:cx7="http://schemas.microsoft.com/office/drawing/2016/5/13/chartex" xmlns:cx8="http://schemas.microsoft.com/office/drawing/2016/5/14/chartex" xmlns:mc="http://schemas.openxmlformats.org/markup-compatibility/2006" xmlns:aink="http://schemas.microsoft.com/office/drawing/2016/ink" xmlns:am3d="http://schemas.microsoft.com/office/drawing/2017/model3d" xmlns:o="urn:schemas-microsoft-com:office:office" xmlns:oel="http://schemas.microsoft.com/office/2019/extlst" xmlns:r="http://schemas.openxmlformats.org/officeDocument/2006/relationships" xmlns:m="http://schemas.openxmlformats.org/officeDocument/2006/math" xmlns:v="urn:schemas-microsoft-com:vml" xmlns:wp14="http://schemas.microsoft.com/office/word/2010/wordprocessingDrawing" xmlns:wp="http://schemas.openxmlformats.org/drawingml/2006/wordprocessingDrawing" xmlns:w10="urn:schemas-microsoft-com:office:word" xmlns:w="http://schemas.openxmlformats.org/wordprocessingml/2006/main" xmlns:w14="http://schemas.microsoft.com/office/word/2010/wordml" xmlns:w15="http://schemas.microsoft.com/office/word/2012/wordml" xmlns:w16cex="http://schemas.microsoft.com/office/word/2018/wordml/cex" xmlns:w16cid="http://schemas.microsoft.com/office/word/2016/wordml/cid" xmlns:w16="http://schemas.microsoft.com/office/word/2018/wordml" xmlns:w16du="http://schemas.microsoft.com/office/word/2023/wordml/word16du" xmlns:w16sdtdh="http://schemas.microsoft.com/office/word/2020/wordml/sdtdatahash" xmlns:w16sdtfl="http://schemas.microsoft.com/office/word/2024/wordml/sdtformatlock" xmlns:w16se="http://schemas.microsoft.com/office/word/2015/wordml/symex" xmlns:wpg="http://schemas.microsoft.com/office/word/2010/wordprocessingGroup" xmlns:wpi="http://schemas.microsoft.com/office/word/2010/wordprocessingInk" xmlns:wne="http://schemas.microsoft.com/office/word/2006/wordml" xmlns:wps="http://schemas.microsoft.com/office/word/2010/wordprocessingShape" mc:Ignorable="w14 w15 w16se w16cid w16 w16cex w16sdtdh w16sdtfl w16du wp14">
   <w:abstractNum w:abstractNumId="0" w15:restartNumberingAfterBreak="0">
+    <w:nsid w:val="374F13C3"/>
+    <w:multiLevelType w:val="hybridMultilevel"/>
+    <w:tmpl w:val="90E8793C"/>
+    <w:lvl w:ilvl="0" w:tplc="041A000F">
+      <w:start w:val="1"/>
+      <w:numFmt w:val="decimal"/>
+      <w:lvlText w:val="%1."/>
+      <w:lvlJc w:val="left"/>
+      <w:pPr>
+        <w:ind w:left="360" w:hanging="360"/>
+      </w:pPr>
+      <w:rPr>
+        <w:rFonts w:hint="default"/>
+      </w:rPr>
+    </w:lvl>
+    <w:lvl w:ilvl="1" w:tplc="041A0019" w:tentative="1">
+      <w:start w:val="1"/>
+      <w:numFmt w:val="lowerLetter"/>
+      <w:lvlText w:val="%2."/>
+      <w:lvlJc w:val="left"/>
+      <w:pPr>
+        <w:ind w:left="1080" w:hanging="360"/>
+      </w:pPr>
+    </w:lvl>
+    <w:lvl w:ilvl="2" w:tplc="041A001B" w:tentative="1">
+      <w:start w:val="1"/>
+      <w:numFmt w:val="lowerRoman"/>
+      <w:lvlText w:val="%3."/>
+      <w:lvlJc w:val="right"/>
+      <w:pPr>
+        <w:ind w:left="1800" w:hanging="180"/>
+      </w:pPr>
+    </w:lvl>
+    <w:lvl w:ilvl="3" w:tplc="041A000F" w:tentative="1">
+      <w:start w:val="1"/>
+      <w:numFmt w:val="decimal"/>
+      <w:lvlText w:val="%4."/>
+      <w:lvlJc w:val="left"/>
+      <w:pPr>
+        <w:ind w:left="2520" w:hanging="360"/>
+      </w:pPr>
+    </w:lvl>
+    <w:lvl w:ilvl="4" w:tplc="041A0019" w:tentative="1">
+      <w:start w:val="1"/>
+      <w:numFmt w:val="lowerLetter"/>
+      <w:lvlText w:val="%5."/>
+      <w:lvlJc w:val="left"/>
+      <w:pPr>
+        <w:ind w:left="3240" w:hanging="360"/>
+      </w:pPr>
+    </w:lvl>
+    <w:lvl w:ilvl="5" w:tplc="041A001B" w:tentative="1">
+      <w:start w:val="1"/>
+      <w:numFmt w:val="lowerRoman"/>
+      <w:lvlText w:val="%6."/>
+      <w:lvlJc w:val="right"/>
+      <w:pPr>
+        <w:ind w:left="3960" w:hanging="180"/>
+      </w:pPr>
+    </w:lvl>
+    <w:lvl w:ilvl="6" w:tplc="041A000F" w:tentative="1">
+      <w:start w:val="1"/>
+      <w:numFmt w:val="decimal"/>
+      <w:lvlText w:val="%7."/>
+      <w:lvlJc w:val="left"/>
+      <w:pPr>
+        <w:ind w:left="4680" w:hanging="360"/>
+      </w:pPr>
+    </w:lvl>
+    <w:lvl w:ilvl="7" w:tplc="041A0019" w:tentative="1">
+      <w:start w:val="1"/>
+      <w:numFmt w:val="lowerLetter"/>
+      <w:lvlText w:val="%8."/>
+      <w:lvlJc w:val="left"/>
+      <w:pPr>
+        <w:ind w:left="5400" w:hanging="360"/>
+      </w:pPr>
+    </w:lvl>
+    <w:lvl w:ilvl="8" w:tplc="041A001B" w:tentative="1">
+      <w:start w:val="1"/>
+      <w:numFmt w:val="lowerRoman"/>
+      <w:lvlText w:val="%9."/>
+      <w:lvlJc w:val="right"/>
+      <w:pPr>
+        <w:ind w:left="6120" w:hanging="180"/>
+      </w:pPr>
+    </w:lvl>
+  </w:abstractNum>
+  <w:abstractNum w:abstractNumId="1" w15:restartNumberingAfterBreak="0">
     <w:nsid w:val="427005EA"/>
     <w:multiLevelType w:val="multilevel"/>
     <w:tmpl w:val="3FEE148A"/>
@@ -6198,7 +7092,7 @@
       </w:rPr>
     </w:lvl>
   </w:abstractNum>
-  <w:abstractNum w:abstractNumId="1" w15:restartNumberingAfterBreak="0">
+  <w:abstractNum w:abstractNumId="2" w15:restartNumberingAfterBreak="0">
     <w:nsid w:val="5C974C70"/>
     <w:multiLevelType w:val="multilevel"/>
     <w:tmpl w:val="6F045368"/>
@@ -6320,7 +7214,7 @@
       </w:pPr>
     </w:lvl>
   </w:abstractNum>
-  <w:abstractNum w:abstractNumId="2" w15:restartNumberingAfterBreak="0">
+  <w:abstractNum w:abstractNumId="3" w15:restartNumberingAfterBreak="0">
     <w:nsid w:val="60B541AC"/>
     <w:multiLevelType w:val="multilevel"/>
     <w:tmpl w:val="5C940E14"/>
@@ -6460,7 +7354,7 @@
       </w:rPr>
     </w:lvl>
   </w:abstractNum>
-  <w:abstractNum w:abstractNumId="3" w15:restartNumberingAfterBreak="0">
+  <w:abstractNum w:abstractNumId="4" w15:restartNumberingAfterBreak="0">
     <w:nsid w:val="797429F0"/>
     <w:multiLevelType w:val="multilevel"/>
     <w:tmpl w:val="2ADCAF5C"/>
@@ -6577,15 +7471,18 @@
     </w:lvl>
   </w:abstractNum>
   <w:num w:numId="1" w16cid:durableId="675352648">
+    <w:abstractNumId w:val="2"/>
+  </w:num>
+  <w:num w:numId="2" w16cid:durableId="1968585083">
+    <w:abstractNumId w:val="3"/>
+  </w:num>
+  <w:num w:numId="3" w16cid:durableId="922304514">
+    <w:abstractNumId w:val="4"/>
+  </w:num>
+  <w:num w:numId="4" w16cid:durableId="138035273">
     <w:abstractNumId w:val="1"/>
   </w:num>
-  <w:num w:numId="2" w16cid:durableId="1968585083">
-    <w:abstractNumId w:val="2"/>
-  </w:num>
-  <w:num w:numId="3" w16cid:durableId="922304514">
-    <w:abstractNumId w:val="3"/>
-  </w:num>
-  <w:num w:numId="4" w16cid:durableId="138035273">
+  <w:num w:numId="5" w16cid:durableId="1535382041">
     <w:abstractNumId w:val="0"/>
   </w:num>
 </w:numbering>
@@ -7058,7 +7955,6 @@
   <w:style w:type="character" w:default="1" w:styleId="DefaultParagraphFont">
     <w:name w:val="Default Paragraph Font"/>
     <w:uiPriority w:val="1"/>
-    <w:semiHidden/>
     <w:unhideWhenUsed/>
   </w:style>
   <w:style w:type="table" w:default="1" w:styleId="TableNormal">
@@ -7526,10 +8422,11 @@
     <w:next w:val="BodyText"/>
     <w:autoRedefine/>
     <w:qFormat/>
-    <w:rsid w:val="006D00C5"/>
+    <w:rsid w:val="00FD56C8"/>
     <w:rPr>
       <w:i/>
-      <w:color w:val="0000FF"/>
+      <w:color w:val="7F7F7F" w:themeColor="text1" w:themeTint="80"/>
+      <w:lang w:val="hr-HR"/>
     </w:rPr>
   </w:style>
   <w:style w:type="paragraph" w:styleId="NormalWeb">

</xml_diff>

<commit_message>
Plan projekta v1.1 (slični projekti)
</commit_message>
<xml_diff>
--- a/docs/Plan projekta.docx
+++ b/docs/Plan projekta.docx
@@ -14,7 +14,7 @@
         <w:rPr>
           <w:lang w:val="hr-HR"/>
         </w:rPr>
-        <w:t>1</w:t>
+        <w:t>Dron.co</w:t>
       </w:r>
     </w:p>
     <w:p>
@@ -55,7 +55,14 @@
           <w:sz w:val="28"/>
           <w:lang w:val="hr-HR"/>
         </w:rPr>
-        <w:t>Verzija 1.0</w:t>
+        <w:t>Verzija 1.</w:t>
+      </w:r>
+      <w:r>
+        <w:rPr>
+          <w:sz w:val="28"/>
+          <w:lang w:val="hr-HR"/>
+        </w:rPr>
+        <w:t>1</w:t>
       </w:r>
     </w:p>
     <w:p>
@@ -147,7 +154,7 @@
                 <w:lang w:val="hr-HR" w:eastAsia="hr-HR"/>
                 <w14:ligatures w14:val="standardContextual"/>
               </w:rPr>
-              <w:tab/>
+              <w:t xml:space="preserve"> </w:t>
             </w:r>
             <w:r>
               <w:rPr>
@@ -235,7 +242,7 @@
                 <w:lang w:val="hr-HR" w:eastAsia="hr-HR"/>
                 <w14:ligatures w14:val="standardContextual"/>
               </w:rPr>
-              <w:tab/>
+              <w:t xml:space="preserve"> </w:t>
             </w:r>
             <w:r>
               <w:rPr>
@@ -323,7 +330,7 @@
                 <w:lang w:val="hr-HR" w:eastAsia="hr-HR"/>
                 <w14:ligatures w14:val="standardContextual"/>
               </w:rPr>
-              <w:tab/>
+              <w:t xml:space="preserve"> </w:t>
             </w:r>
             <w:r>
               <w:rPr>
@@ -411,7 +418,7 @@
                 <w:lang w:val="hr-HR" w:eastAsia="hr-HR"/>
                 <w14:ligatures w14:val="standardContextual"/>
               </w:rPr>
-              <w:tab/>
+              <w:t xml:space="preserve"> </w:t>
             </w:r>
             <w:r>
               <w:rPr>
@@ -499,7 +506,7 @@
                 <w:lang w:val="hr-HR" w:eastAsia="hr-HR"/>
                 <w14:ligatures w14:val="standardContextual"/>
               </w:rPr>
-              <w:tab/>
+              <w:t xml:space="preserve"> </w:t>
             </w:r>
             <w:r>
               <w:rPr>
@@ -587,7 +594,7 @@
                 <w:lang w:val="hr-HR" w:eastAsia="hr-HR"/>
                 <w14:ligatures w14:val="standardContextual"/>
               </w:rPr>
-              <w:tab/>
+              <w:t xml:space="preserve"> </w:t>
             </w:r>
             <w:r>
               <w:rPr>
@@ -675,7 +682,7 @@
                 <w:lang w:val="hr-HR" w:eastAsia="hr-HR"/>
                 <w14:ligatures w14:val="standardContextual"/>
               </w:rPr>
-              <w:tab/>
+              <w:t xml:space="preserve"> </w:t>
             </w:r>
             <w:r>
               <w:rPr>
@@ -763,7 +770,7 @@
                 <w:lang w:val="hr-HR" w:eastAsia="hr-HR"/>
                 <w14:ligatures w14:val="standardContextual"/>
               </w:rPr>
-              <w:tab/>
+              <w:t xml:space="preserve"> </w:t>
             </w:r>
             <w:r>
               <w:rPr>
@@ -851,7 +858,7 @@
                 <w:lang w:val="hr-HR" w:eastAsia="hr-HR"/>
                 <w14:ligatures w14:val="standardContextual"/>
               </w:rPr>
-              <w:tab/>
+              <w:t xml:space="preserve"> </w:t>
             </w:r>
             <w:r>
               <w:rPr>
@@ -939,7 +946,7 @@
                 <w:lang w:val="hr-HR" w:eastAsia="hr-HR"/>
                 <w14:ligatures w14:val="standardContextual"/>
               </w:rPr>
-              <w:tab/>
+              <w:t xml:space="preserve"> </w:t>
             </w:r>
             <w:r>
               <w:rPr>
@@ -1027,7 +1034,7 @@
                 <w:lang w:val="hr-HR" w:eastAsia="hr-HR"/>
                 <w14:ligatures w14:val="standardContextual"/>
               </w:rPr>
-              <w:tab/>
+              <w:t xml:space="preserve"> </w:t>
             </w:r>
             <w:r>
               <w:rPr>
@@ -1115,7 +1122,7 @@
                 <w:lang w:val="hr-HR" w:eastAsia="hr-HR"/>
                 <w14:ligatures w14:val="standardContextual"/>
               </w:rPr>
-              <w:tab/>
+              <w:t xml:space="preserve"> </w:t>
             </w:r>
             <w:r>
               <w:rPr>
@@ -1220,7 +1227,7 @@
                 <w:lang w:val="hr-HR" w:eastAsia="hr-HR"/>
                 <w14:ligatures w14:val="standardContextual"/>
               </w:rPr>
-              <w:tab/>
+              <w:t xml:space="preserve"> </w:t>
             </w:r>
             <w:r>
               <w:rPr>
@@ -1326,7 +1333,7 @@
                 <w:lang w:val="hr-HR" w:eastAsia="hr-HR"/>
                 <w14:ligatures w14:val="standardContextual"/>
               </w:rPr>
-              <w:tab/>
+              <w:t xml:space="preserve"> </w:t>
             </w:r>
             <w:r>
               <w:rPr>
@@ -1414,7 +1421,7 @@
                 <w:lang w:val="hr-HR" w:eastAsia="hr-HR"/>
                 <w14:ligatures w14:val="standardContextual"/>
               </w:rPr>
-              <w:tab/>
+              <w:t xml:space="preserve"> </w:t>
             </w:r>
             <w:r>
               <w:rPr>
@@ -1487,6 +1494,7 @@
     <w:p>
       <w:pPr>
         <w:pStyle w:val="Title"/>
+        <w:jc w:val="left"/>
         <w:rPr>
           <w:lang w:val="hr-HR"/>
         </w:rPr>
@@ -1996,11 +2004,18 @@
     </w:p>
     <w:p>
       <w:pPr>
-        <w:pStyle w:val="BodyText"/>
-        <w:rPr>
-          <w:lang w:val="hr-HR"/>
-        </w:rPr>
-      </w:pPr>
+        <w:widowControl/>
+        <w:spacing w:line="240" w:lineRule="auto"/>
+        <w:rPr>
+          <w:lang w:val="hr-HR"/>
+        </w:rPr>
+      </w:pPr>
+      <w:r>
+        <w:rPr>
+          <w:lang w:val="hr-HR"/>
+        </w:rPr>
+        <w:br w:type="page"/>
+      </w:r>
     </w:p>
     <w:p>
       <w:pPr>
@@ -2019,6 +2034,7 @@
         <w:rPr>
           <w:lang w:val="hr-HR"/>
         </w:rPr>
+        <w:lastRenderedPageBreak/>
         <w:t>Slični projekti</w:t>
       </w:r>
       <w:bookmarkEnd w:id="11"/>
@@ -2027,38 +2043,136 @@
     <w:p>
       <w:pPr>
         <w:pStyle w:val="BodyText"/>
-        <w:rPr>
-          <w:lang w:val="hr-HR"/>
-        </w:rPr>
-      </w:pPr>
-      <w:r>
-        <w:rPr>
-          <w:lang w:val="hr-HR"/>
-        </w:rPr>
-        <w:t>(po dogovoru)</w:t>
+        <w:numPr>
+          <w:ilvl w:val="0"/>
+          <w:numId w:val="6"/>
+        </w:numPr>
+        <w:rPr>
+          <w:lang w:val="hr-HR"/>
+        </w:rPr>
+      </w:pPr>
+      <w:r>
+        <w:rPr>
+          <w:lang w:val="hr-HR"/>
+        </w:rPr>
+        <w:t>Gradska utrka dronova (eng. Urban drone race),</w:t>
+      </w:r>
+      <w:r>
+        <w:rPr>
+          <w:lang w:val="hr-HR"/>
+        </w:rPr>
+        <w:br/>
+      </w:r>
+      <w:hyperlink r:id="rId11" w:history="1">
+        <w:r>
+          <w:rPr>
+            <w:rStyle w:val="Hyperlink"/>
+            <w:lang w:val="hr-HR"/>
+          </w:rPr>
+          <w:t>https://github.com/Wjppppp/Urban-Drone-Race</w:t>
+        </w:r>
+      </w:hyperlink>
+      <w:r>
+        <w:rPr>
+          <w:lang w:val="hr-HR"/>
+        </w:rPr>
+        <w:t xml:space="preserve"> </w:t>
+      </w:r>
+      <w:r>
+        <w:rPr>
+          <w:lang w:val="hr-HR"/>
+        </w:rPr>
+        <w:t>(pristupljeno 11.11.2025.)</w:t>
       </w:r>
     </w:p>
     <w:p>
       <w:pPr>
         <w:pStyle w:val="BodyText"/>
-        <w:rPr>
-          <w:lang w:val="hr-HR"/>
-        </w:rPr>
-      </w:pPr>
+        <w:numPr>
+          <w:ilvl w:val="0"/>
+          <w:numId w:val="6"/>
+        </w:numPr>
+        <w:rPr>
+          <w:lang w:val="hr-HR"/>
+        </w:rPr>
+      </w:pPr>
+      <w:r>
+        <w:rPr>
+          <w:lang w:val="hr-HR"/>
+        </w:rPr>
+        <w:t>Simulacija drona (eng. Drone simulation)</w:t>
+      </w:r>
+      <w:r>
+        <w:rPr>
+          <w:lang w:val="hr-HR"/>
+        </w:rPr>
+        <w:br/>
+      </w:r>
+      <w:hyperlink r:id="rId12" w:history="1">
+        <w:r>
+          <w:rPr>
+            <w:rStyle w:val="Hyperlink"/>
+            <w:lang w:val="hr-HR"/>
+          </w:rPr>
+          <w:t>https://github.com/Kshitij08/Drone-Simulation</w:t>
+        </w:r>
+      </w:hyperlink>
+      <w:r>
+        <w:rPr>
+          <w:lang w:val="hr-HR"/>
+        </w:rPr>
+        <w:t xml:space="preserve"> </w:t>
+      </w:r>
+      <w:r>
+        <w:rPr>
+          <w:lang w:val="hr-HR"/>
+        </w:rPr>
+        <w:t>(pristupljeno 11.11.2025.)</w:t>
+      </w:r>
     </w:p>
     <w:p>
       <w:pPr>
-        <w:widowControl/>
-        <w:spacing w:line="240" w:lineRule="auto"/>
-        <w:rPr>
-          <w:lang w:val="hr-HR"/>
-        </w:rPr>
-      </w:pPr>
-      <w:r>
-        <w:rPr>
-          <w:lang w:val="hr-HR"/>
-        </w:rPr>
-        <w:br w:type="page"/>
+        <w:pStyle w:val="BodyText"/>
+        <w:numPr>
+          <w:ilvl w:val="0"/>
+          <w:numId w:val="6"/>
+        </w:numPr>
+        <w:rPr>
+          <w:lang w:val="hr-HR"/>
+        </w:rPr>
+      </w:pPr>
+      <w:r>
+        <w:rPr>
+          <w:lang w:val="hr-HR"/>
+        </w:rPr>
+        <w:t>Dostava dronom (eng. Drone delivery)</w:t>
+      </w:r>
+      <w:r>
+        <w:rPr>
+          <w:lang w:val="hr-HR"/>
+        </w:rPr>
+        <w:br/>
+      </w:r>
+      <w:hyperlink r:id="rId13" w:history="1">
+        <w:r>
+          <w:rPr>
+            <w:rStyle w:val="Hyperlink"/>
+            <w:lang w:val="hr-HR"/>
+          </w:rPr>
+          <w:t>https://github.com/Michael-Sjogren/DroneDelivery</w:t>
+        </w:r>
+      </w:hyperlink>
+      <w:r>
+        <w:rPr>
+          <w:lang w:val="hr-HR"/>
+        </w:rPr>
+        <w:t xml:space="preserve"> </w:t>
+      </w:r>
+      <w:r>
+        <w:rPr>
+          <w:lang w:val="hr-HR"/>
+        </w:rPr>
+        <w:t>(pristupljeno 11.11.2025.)</w:t>
       </w:r>
     </w:p>
     <w:p>
@@ -2079,7 +2193,6 @@
         <w:rPr>
           <w:lang w:val="hr-HR"/>
         </w:rPr>
-        <w:lastRenderedPageBreak/>
         <w:t>Resursi</w:t>
       </w:r>
       <w:bookmarkEnd w:id="13"/>
@@ -2845,13 +2958,6 @@
       <w:bookmarkEnd w:id="16"/>
       <w:bookmarkEnd w:id="17"/>
     </w:p>
-    <w:p>
-      <w:pPr>
-        <w:rPr>
-          <w:lang w:val="hr-HR"/>
-        </w:rPr>
-      </w:pPr>
-    </w:p>
     <w:tbl>
       <w:tblPr>
         <w:tblStyle w:val="TableGrid"/>
@@ -3110,13 +3216,6 @@
     </w:p>
     <w:p>
       <w:pPr>
-        <w:rPr>
-          <w:lang w:val="hr-HR"/>
-        </w:rPr>
-      </w:pPr>
-    </w:p>
-    <w:p>
-      <w:pPr>
         <w:pStyle w:val="BodyText"/>
         <w:rPr>
           <w:lang w:val="hr-HR"/>
@@ -3261,13 +3360,6 @@
     </w:p>
     <w:p>
       <w:pPr>
-        <w:rPr>
-          <w:lang w:val="hr-HR"/>
-        </w:rPr>
-      </w:pPr>
-    </w:p>
-    <w:p>
-      <w:pPr>
         <w:pStyle w:val="BodyText"/>
         <w:numPr>
           <w:ilvl w:val="0"/>
@@ -3752,13 +3844,6 @@
       <w:bookmarkEnd w:id="23"/>
       <w:bookmarkEnd w:id="24"/>
       <w:bookmarkEnd w:id="25"/>
-    </w:p>
-    <w:p>
-      <w:pPr>
-        <w:rPr>
-          <w:lang w:val="hr-HR"/>
-        </w:rPr>
-      </w:pPr>
     </w:p>
     <w:p>
       <w:pPr>
@@ -3789,7 +3874,7 @@
                     <pic:cNvPicPr/>
                   </pic:nvPicPr>
                   <pic:blipFill>
-                    <a:blip r:embed="rId11">
+                    <a:blip r:embed="rId14">
                       <a:extLst>
                         <a:ext uri="{28A0092B-C50C-407E-A947-70E740481C1C}">
                           <a14:useLocalDpi xmlns:a14="http://schemas.microsoft.com/office/drawing/2010/main" val="0"/>
@@ -3866,15 +3951,6 @@
           <w:lang w:val="hr-HR"/>
         </w:rPr>
       </w:pPr>
-    </w:p>
-    <w:p>
-      <w:pPr>
-        <w:pStyle w:val="BodyText"/>
-        <w:rPr>
-          <w:b/>
-          <w:lang w:val="hr-HR"/>
-        </w:rPr>
-      </w:pPr>
       <w:r>
         <w:rPr>
           <w:b/>
@@ -4748,13 +4824,6 @@
     </w:p>
     <w:p>
       <w:pPr>
-        <w:rPr>
-          <w:lang w:val="hr-HR"/>
-        </w:rPr>
-      </w:pPr>
-    </w:p>
-    <w:p>
-      <w:pPr>
         <w:pStyle w:val="Heading1"/>
         <w:numPr>
           <w:ilvl w:val="0"/>
@@ -4770,18 +4839,11 @@
         <w:rPr>
           <w:lang w:val="hr-HR"/>
         </w:rPr>
+        <w:lastRenderedPageBreak/>
         <w:t>Gantogram</w:t>
       </w:r>
       <w:bookmarkEnd w:id="28"/>
       <w:bookmarkEnd w:id="29"/>
-    </w:p>
-    <w:p>
-      <w:pPr>
-        <w:pStyle w:val="BodyText"/>
-        <w:rPr>
-          <w:lang w:val="hr-HR"/>
-        </w:rPr>
-      </w:pPr>
     </w:p>
     <w:p>
       <w:pPr>
@@ -4807,7 +4869,7 @@
                     <pic:cNvPicPr/>
                   </pic:nvPicPr>
                   <pic:blipFill>
-                    <a:blip r:embed="rId12" cstate="print">
+                    <a:blip r:embed="rId15" cstate="print">
                       <a:extLst>
                         <a:ext uri="{28A0092B-C50C-407E-A947-70E740481C1C}">
                           <a14:useLocalDpi xmlns:a14="http://schemas.microsoft.com/office/drawing/2010/main" val="0"/>
@@ -4872,11 +4934,6 @@
       <w:bookmarkEnd w:id="30"/>
       <w:bookmarkEnd w:id="31"/>
     </w:p>
-    <w:p>
-      <w:pPr>
-        <w:pStyle w:val="InfoBlue"/>
-      </w:pPr>
-    </w:p>
     <w:tbl>
       <w:tblPr>
         <w:tblStyle w:val="TableGrid"/>
@@ -6440,10 +6497,10 @@
     <w:p>
       <w:pPr>
         <w:sectPr>
-          <w:headerReference w:type="default" r:id="rId13"/>
-          <w:footerReference w:type="default" r:id="rId14"/>
-          <w:headerReference w:type="first" r:id="rId15"/>
-          <w:footerReference w:type="first" r:id="rId16"/>
+          <w:headerReference w:type="default" r:id="rId16"/>
+          <w:footerReference w:type="default" r:id="rId17"/>
+          <w:headerReference w:type="first" r:id="rId18"/>
+          <w:footerReference w:type="first" r:id="rId19"/>
           <w:pgSz w:w="12240" w:h="15840"/>
           <w:pgMar w:top="1440" w:right="1440" w:bottom="1440" w:left="1440" w:header="720" w:footer="720" w:gutter="0"/>
           <w:cols w:space="720"/>
@@ -6864,7 +6921,13 @@
             <w:rPr>
               <w:lang w:val="hr-HR"/>
             </w:rPr>
-            <w:t>FER - Projekt</w:t>
+            <w:t xml:space="preserve">FER </w:t>
+          </w:r>
+          <w:r>
+            <w:rPr>
+              <w:lang w:val="hr-HR"/>
+            </w:rPr>
+            <w:t>- Projekt</w:t>
           </w:r>
         </w:p>
       </w:tc>
@@ -7320,7 +7383,13 @@
             <w:rPr>
               <w:lang w:val="hr-HR"/>
             </w:rPr>
-            <w:t xml:space="preserve">  Verzija:           1.0</w:t>
+            <w:t xml:space="preserve">  Verzija:           1.</w:t>
+          </w:r>
+          <w:r>
+            <w:rPr>
+              <w:lang w:val="hr-HR"/>
+            </w:rPr>
+            <w:t>1</w:t>
           </w:r>
         </w:p>
       </w:tc>
@@ -7376,7 +7445,7 @@
             <w:rPr>
               <w:lang w:val="hr-HR"/>
             </w:rPr>
-            <w:t>0</w:t>
+            <w:t>1</w:t>
           </w:r>
           <w:r>
             <w:rPr>
@@ -7596,7 +7665,13 @@
             <w:rPr>
               <w:lang w:val="hr-HR"/>
             </w:rPr>
-            <w:t xml:space="preserve">  Verzija:           1.0</w:t>
+            <w:t xml:space="preserve">  Verzija:           1.</w:t>
+          </w:r>
+          <w:r>
+            <w:rPr>
+              <w:lang w:val="hr-HR"/>
+            </w:rPr>
+            <w:t>1</w:t>
           </w:r>
         </w:p>
       </w:tc>
@@ -7652,7 +7727,13 @@
             <w:rPr>
               <w:lang w:val="hr-HR"/>
             </w:rPr>
-            <w:t>10</w:t>
+            <w:t>1</w:t>
+          </w:r>
+          <w:r>
+            <w:rPr>
+              <w:lang w:val="hr-HR"/>
+            </w:rPr>
+            <w:t>1</w:t>
           </w:r>
           <w:r>
             <w:rPr>
@@ -8299,6 +8380,119 @@
       </w:pPr>
     </w:lvl>
   </w:abstractNum>
+  <w:abstractNum w:abstractNumId="5" w15:restartNumberingAfterBreak="0">
+    <w:nsid w:val="7C8D7D73"/>
+    <w:multiLevelType w:val="hybridMultilevel"/>
+    <w:tmpl w:val="C340FFB6"/>
+    <w:lvl w:ilvl="0" w:tplc="012C65E0">
+      <w:start w:val="1"/>
+      <w:numFmt w:val="bullet"/>
+      <w:lvlText w:val="-"/>
+      <w:lvlJc w:val="left"/>
+      <w:pPr>
+        <w:ind w:left="1080" w:hanging="360"/>
+      </w:pPr>
+      <w:rPr>
+        <w:rFonts w:ascii="Times New Roman" w:eastAsia="Times New Roman" w:hAnsi="Times New Roman" w:cs="Times New Roman" w:hint="default"/>
+      </w:rPr>
+    </w:lvl>
+    <w:lvl w:ilvl="1" w:tplc="041A0003" w:tentative="1">
+      <w:start w:val="1"/>
+      <w:numFmt w:val="bullet"/>
+      <w:lvlText w:val="o"/>
+      <w:lvlJc w:val="left"/>
+      <w:pPr>
+        <w:ind w:left="1800" w:hanging="360"/>
+      </w:pPr>
+      <w:rPr>
+        <w:rFonts w:ascii="Courier New" w:hAnsi="Courier New" w:cs="Courier New" w:hint="default"/>
+      </w:rPr>
+    </w:lvl>
+    <w:lvl w:ilvl="2" w:tplc="041A0005" w:tentative="1">
+      <w:start w:val="1"/>
+      <w:numFmt w:val="bullet"/>
+      <w:lvlText w:val=""/>
+      <w:lvlJc w:val="left"/>
+      <w:pPr>
+        <w:ind w:left="2520" w:hanging="360"/>
+      </w:pPr>
+      <w:rPr>
+        <w:rFonts w:ascii="Wingdings" w:hAnsi="Wingdings" w:hint="default"/>
+      </w:rPr>
+    </w:lvl>
+    <w:lvl w:ilvl="3" w:tplc="041A0001" w:tentative="1">
+      <w:start w:val="1"/>
+      <w:numFmt w:val="bullet"/>
+      <w:lvlText w:val=""/>
+      <w:lvlJc w:val="left"/>
+      <w:pPr>
+        <w:ind w:left="3240" w:hanging="360"/>
+      </w:pPr>
+      <w:rPr>
+        <w:rFonts w:ascii="Symbol" w:hAnsi="Symbol" w:hint="default"/>
+      </w:rPr>
+    </w:lvl>
+    <w:lvl w:ilvl="4" w:tplc="041A0003" w:tentative="1">
+      <w:start w:val="1"/>
+      <w:numFmt w:val="bullet"/>
+      <w:lvlText w:val="o"/>
+      <w:lvlJc w:val="left"/>
+      <w:pPr>
+        <w:ind w:left="3960" w:hanging="360"/>
+      </w:pPr>
+      <w:rPr>
+        <w:rFonts w:ascii="Courier New" w:hAnsi="Courier New" w:cs="Courier New" w:hint="default"/>
+      </w:rPr>
+    </w:lvl>
+    <w:lvl w:ilvl="5" w:tplc="041A0005" w:tentative="1">
+      <w:start w:val="1"/>
+      <w:numFmt w:val="bullet"/>
+      <w:lvlText w:val=""/>
+      <w:lvlJc w:val="left"/>
+      <w:pPr>
+        <w:ind w:left="4680" w:hanging="360"/>
+      </w:pPr>
+      <w:rPr>
+        <w:rFonts w:ascii="Wingdings" w:hAnsi="Wingdings" w:hint="default"/>
+      </w:rPr>
+    </w:lvl>
+    <w:lvl w:ilvl="6" w:tplc="041A0001" w:tentative="1">
+      <w:start w:val="1"/>
+      <w:numFmt w:val="bullet"/>
+      <w:lvlText w:val=""/>
+      <w:lvlJc w:val="left"/>
+      <w:pPr>
+        <w:ind w:left="5400" w:hanging="360"/>
+      </w:pPr>
+      <w:rPr>
+        <w:rFonts w:ascii="Symbol" w:hAnsi="Symbol" w:hint="default"/>
+      </w:rPr>
+    </w:lvl>
+    <w:lvl w:ilvl="7" w:tplc="041A0003" w:tentative="1">
+      <w:start w:val="1"/>
+      <w:numFmt w:val="bullet"/>
+      <w:lvlText w:val="o"/>
+      <w:lvlJc w:val="left"/>
+      <w:pPr>
+        <w:ind w:left="6120" w:hanging="360"/>
+      </w:pPr>
+      <w:rPr>
+        <w:rFonts w:ascii="Courier New" w:hAnsi="Courier New" w:cs="Courier New" w:hint="default"/>
+      </w:rPr>
+    </w:lvl>
+    <w:lvl w:ilvl="8" w:tplc="041A0005" w:tentative="1">
+      <w:start w:val="1"/>
+      <w:numFmt w:val="bullet"/>
+      <w:lvlText w:val=""/>
+      <w:lvlJc w:val="left"/>
+      <w:pPr>
+        <w:ind w:left="6840" w:hanging="360"/>
+      </w:pPr>
+      <w:rPr>
+        <w:rFonts w:ascii="Wingdings" w:hAnsi="Wingdings" w:hint="default"/>
+      </w:rPr>
+    </w:lvl>
+  </w:abstractNum>
   <w:num w:numId="1" w16cid:durableId="675352648">
     <w:abstractNumId w:val="2"/>
   </w:num>
@@ -8313,6 +8507,9 @@
   </w:num>
   <w:num w:numId="5" w16cid:durableId="1535382041">
     <w:abstractNumId w:val="0"/>
+  </w:num>
+  <w:num w:numId="6" w16cid:durableId="556017369">
+    <w:abstractNumId w:val="5"/>
   </w:num>
 </w:numbering>
 </file>
@@ -9373,6 +9570,18 @@
       </w:tblBorders>
     </w:tblPr>
   </w:style>
+  <w:style w:type="character" w:styleId="UnresolvedMention">
+    <w:name w:val="Unresolved Mention"/>
+    <w:basedOn w:val="DefaultParagraphFont"/>
+    <w:uiPriority w:val="99"/>
+    <w:semiHidden/>
+    <w:unhideWhenUsed/>
+    <w:rsid w:val="008B4BF2"/>
+    <w:rPr>
+      <w:color w:val="605E5C"/>
+      <w:shd w:val="clear" w:color="auto" w:fill="E1DFDD"/>
+    </w:rPr>
+  </w:style>
 </w:styles>
 </file>
 

</xml_diff>